<commit_message>
Scrutinize paper facts against codebase and assess novelty
Convert paper to single-column format

Fix author numbering/affiliations

Fix factual discrepancies found (batch size, activations, citations)
</commit_message>
<xml_diff>
--- a/templates/paper.docx
+++ b/templates/paper.docx
@@ -1,40 +1,20 @@
 
 <file path=word/document.xml><?xml version="1.0" encoding="utf-8"?>
-<w:document xmlns:wpc="http://schemas.microsoft.com/office/word/2010/wordprocessingCanvas" xmlns:cx="http://schemas.microsoft.com/office/drawing/2014/chartex" xmlns:cx1="http://schemas.microsoft.com/office/drawing/2015/9/8/chartex" xmlns:mc="http://schemas.openxmlformats.org/markup-compatibility/2006" xmlns:o="urn:schemas-microsoft-com:office:office" xmlns:r="http://schemas.openxmlformats.org/officeDocument/2006/relationships" xmlns:m="http://schemas.openxmlformats.org/officeDocument/2006/math" xmlns:v="urn:schemas-microsoft-com:vml" xmlns:wp14="http://schemas.microsoft.com/office/word/2010/wordprocessingDrawing" xmlns:wp="http://schemas.openxmlformats.org/drawingml/2006/wordprocessingDrawing" xmlns:w10="urn:schemas-microsoft-com:office:word" xmlns:w="http://schemas.openxmlformats.org/wordprocessingml/2006/main" xmlns:w14="http://schemas.microsoft.com/office/word/2010/wordml" xmlns:w15="http://schemas.microsoft.com/office/word/2012/wordml" xmlns:w16se="http://schemas.microsoft.com/office/word/2015/wordml/symex" xmlns:wpg="http://schemas.microsoft.com/office/word/2010/wordprocessingGroup" xmlns:wpi="http://schemas.microsoft.com/office/word/2010/wordprocessingInk" xmlns:wne="http://schemas.microsoft.com/office/word/2006/wordml" xmlns:wps="http://schemas.microsoft.com/office/word/2010/wordprocessingShape" mc:Ignorable="w14 w15 w16se wp14">
+<w:document xmlns:wpc="http://schemas.microsoft.com/office/word/2010/wordprocessingCanvas" xmlns:cx="http://schemas.microsoft.com/office/drawing/2014/chartex" xmlns:cx1="http://schemas.microsoft.com/office/drawing/2015/9/8/chartex" xmlns:cx2="http://schemas.microsoft.com/office/drawing/2015/10/21/chartex" xmlns:cx3="http://schemas.microsoft.com/office/drawing/2016/5/9/chartex" xmlns:cx4="http://schemas.microsoft.com/office/drawing/2016/5/10/chartex" xmlns:cx5="http://schemas.microsoft.com/office/drawing/2016/5/11/chartex" xmlns:cx6="http://schemas.microsoft.com/office/drawing/2016/5/12/chartex" xmlns:cx7="http://schemas.microsoft.com/office/drawing/2016/5/13/chartex" xmlns:cx8="http://schemas.microsoft.com/office/drawing/2016/5/14/chartex" xmlns:mc="http://schemas.openxmlformats.org/markup-compatibility/2006" xmlns:aink="http://schemas.microsoft.com/office/drawing/2016/ink" xmlns:am3d="http://schemas.microsoft.com/office/drawing/2017/model3d" xmlns:o="urn:schemas-microsoft-com:office:office" xmlns:oel="http://schemas.microsoft.com/office/2019/extlst" xmlns:r="http://schemas.openxmlformats.org/officeDocument/2006/relationships" xmlns:m="http://schemas.openxmlformats.org/officeDocument/2006/math" xmlns:v="urn:schemas-microsoft-com:vml" xmlns:wp14="http://schemas.microsoft.com/office/word/2010/wordprocessingDrawing" xmlns:wp="http://schemas.openxmlformats.org/drawingml/2006/wordprocessingDrawing" xmlns:w10="urn:schemas-microsoft-com:office:word" xmlns:w="http://schemas.openxmlformats.org/wordprocessingml/2006/main" xmlns:w14="http://schemas.microsoft.com/office/word/2010/wordml" xmlns:w15="http://schemas.microsoft.com/office/word/2012/wordml" xmlns:w16cex="http://schemas.microsoft.com/office/word/2018/wordml/cex" xmlns:w16cid="http://schemas.microsoft.com/office/word/2016/wordml/cid" xmlns:w16="http://schemas.microsoft.com/office/word/2018/wordml" xmlns:w16du="http://schemas.microsoft.com/office/word/2023/wordml/word16du" xmlns:w16sdtdh="http://schemas.microsoft.com/office/word/2020/wordml/sdtdatahash" xmlns:w16sdtfl="http://schemas.microsoft.com/office/word/2024/wordml/sdtformatlock" xmlns:w16se="http://schemas.microsoft.com/office/word/2015/wordml/symex" xmlns:wpg="http://schemas.microsoft.com/office/word/2010/wordprocessingGroup" xmlns:wpi="http://schemas.microsoft.com/office/word/2010/wordprocessingInk" xmlns:wne="http://schemas.microsoft.com/office/word/2006/wordml" xmlns:wps="http://schemas.microsoft.com/office/word/2010/wordprocessingShape" mc:Ignorable="w14 w15 w16se w16cid w16 w16cex w16sdtdh w16sdtfl w16du wp14">
   <w:body>
-    <w:p/>
-    <w:p>
-      <w:pPr>
-        <w:pStyle w:val="ChapterNumber"/>
-      </w:pPr>
-      <w:r>
-        <w:t>Chapter</w:t>
-      </w:r>
-      <w:r>
-        <w:t xml:space="preserve"> </w:t>
-      </w:r>
-    </w:p>
-    <w:p/>
     <w:p>
       <w:pPr>
         <w:ind w:firstLine="0"/>
-        <w:jc w:val="left"/>
+      </w:pPr>
+      <w:r>
         <w:rPr>
           <w:b/>
           <w:sz w:val="32"/>
           <w:szCs w:val="32"/>
         </w:rPr>
-      </w:pPr>
-      <w:r>
-        <w:rPr>
-          <w:b/>
-          <w:sz w:val="32"/>
-          <w:szCs w:val="32"/>
-        </w:rPr>
-        <w:t>Mobile Learning Literature Review in Medical Education</w:t>
-      </w:r>
-    </w:p>
-    <w:p/>
+        <w:t>One Bit is All You Need to Diffuse</w:t>
+      </w:r>
+    </w:p>
     <w:p/>
     <w:p>
       <w:pPr>
@@ -48,7 +28,7 @@
           <w:sz w:val="28"/>
           <w:szCs w:val="28"/>
         </w:rPr>
-        <w:t>Heeyoung Han</w:t>
+        <w:t>Nihal Gazi</w:t>
       </w:r>
       <w:r>
         <w:rPr>
@@ -67,7 +47,16 @@
           <w:sz w:val="28"/>
           <w:szCs w:val="28"/>
         </w:rPr>
-        <w:t>, Larry Hurtubise</w:t>
+        <w:t xml:space="preserve">, </w:t>
+      </w:r>
+      <w:r>
+        <w:rPr>
+          <w:b/>
+          <w:bCs/>
+          <w:sz w:val="28"/>
+          <w:szCs w:val="28"/>
+        </w:rPr>
+        <w:t>Ayushman Bhattacharya</w:t>
       </w:r>
       <w:r>
         <w:rPr>
@@ -86,7 +75,16 @@
           <w:sz w:val="28"/>
           <w:szCs w:val="28"/>
         </w:rPr>
-        <w:t>, Geraud Plantegenest</w:t>
+        <w:t xml:space="preserve">, </w:t>
+      </w:r>
+      <w:r>
+        <w:rPr>
+          <w:b/>
+          <w:bCs/>
+          <w:sz w:val="28"/>
+          <w:szCs w:val="28"/>
+        </w:rPr>
+        <w:t>Aditya K. Biswas</w:t>
       </w:r>
       <w:r>
         <w:rPr>
@@ -105,7 +103,16 @@
           <w:sz w:val="28"/>
           <w:szCs w:val="28"/>
         </w:rPr>
-        <w:t>, Carolyn R. Rohrer Vitek</w:t>
+        <w:t xml:space="preserve">, </w:t>
+      </w:r>
+      <w:r>
+        <w:rPr>
+          <w:b/>
+          <w:bCs/>
+          <w:sz w:val="28"/>
+          <w:szCs w:val="28"/>
+        </w:rPr>
+        <w:t>Saubhagya Kunti</w:t>
       </w:r>
       <w:r>
         <w:rPr>
@@ -124,7 +131,27 @@
           <w:sz w:val="28"/>
           <w:szCs w:val="28"/>
         </w:rPr>
-        <w:t>, Rahul Patwari</w:t>
+        <w:t xml:space="preserve">, </w:t>
+      </w:r>
+      <w:proofErr w:type="spellStart"/>
+      <w:r>
+        <w:rPr>
+          <w:b/>
+          <w:bCs/>
+          <w:sz w:val="28"/>
+          <w:szCs w:val="28"/>
+        </w:rPr>
+        <w:t>Aihik</w:t>
+      </w:r>
+      <w:proofErr w:type="spellEnd"/>
+      <w:r>
+        <w:rPr>
+          <w:b/>
+          <w:bCs/>
+          <w:sz w:val="28"/>
+          <w:szCs w:val="28"/>
+        </w:rPr>
+        <w:t xml:space="preserve"> Basu</w:t>
       </w:r>
       <w:r>
         <w:rPr>
@@ -136,62 +163,6 @@
         </w:rPr>
         <w:t>5</w:t>
       </w:r>
-      <w:r>
-        <w:rPr>
-          <w:b/>
-          <w:bCs/>
-          <w:sz w:val="28"/>
-          <w:szCs w:val="28"/>
-        </w:rPr>
-        <w:t>, Cecile Foshee</w:t>
-      </w:r>
-      <w:r>
-        <w:rPr>
-          <w:b/>
-          <w:bCs/>
-          <w:sz w:val="28"/>
-          <w:szCs w:val="28"/>
-          <w:vertAlign w:val="superscript"/>
-        </w:rPr>
-        <w:t>6</w:t>
-      </w:r>
-      <w:r>
-        <w:rPr>
-          <w:b/>
-          <w:bCs/>
-          <w:sz w:val="28"/>
-          <w:szCs w:val="28"/>
-        </w:rPr>
-        <w:t>,</w:t>
-      </w:r>
-      <w:r>
-        <w:rPr>
-          <w:b/>
-          <w:bCs/>
-          <w:sz w:val="28"/>
-          <w:szCs w:val="28"/>
-        </w:rPr>
-        <w:br/>
-      </w:r>
-      <w:r>
-        <w:rPr>
-          <w:b/>
-          <w:bCs/>
-          <w:sz w:val="28"/>
-          <w:szCs w:val="28"/>
-        </w:rPr>
-        <w:t>and Elissa R. Hall</w:t>
-      </w:r>
-      <w:r>
-        <w:rPr>
-          <w:b/>
-          <w:bCs/>
-          <w:sz w:val="28"/>
-          <w:szCs w:val="28"/>
-          <w:vertAlign w:val="superscript"/>
-        </w:rPr>
-        <w:t>7</w:t>
-      </w:r>
     </w:p>
     <w:p>
       <w:pPr>
@@ -215,21 +186,14 @@
           <w:sz w:val="18"/>
           <w:szCs w:val="18"/>
         </w:rPr>
-        <w:t xml:space="preserve"> Department of Medical Education, Southern Illinois University School of Medicine, </w:t>
+        <w:t xml:space="preserve"> </w:t>
       </w:r>
       <w:r>
         <w:rPr>
           <w:sz w:val="18"/>
           <w:szCs w:val="18"/>
         </w:rPr>
-        <w:br/>
-      </w:r>
-      <w:r>
-        <w:rPr>
-          <w:sz w:val="18"/>
-          <w:szCs w:val="18"/>
-        </w:rPr>
-        <w:t>Springfield, Illinois, USA</w:t>
+        <w:t>Department of Computer Science Engineering and AI &amp; ML, Institute of Engineering and Management, Kolkata, India</w:t>
       </w:r>
     </w:p>
     <w:p>
@@ -254,7 +218,14 @@
           <w:sz w:val="18"/>
           <w:szCs w:val="18"/>
         </w:rPr>
-        <w:t xml:space="preserve"> Family Medicine, Heritage College of Osteopathic Medicine Dublin, Dublin, Ohio, USA</w:t>
+        <w:t xml:space="preserve"> </w:t>
+      </w:r>
+      <w:r>
+        <w:rPr>
+          <w:sz w:val="18"/>
+          <w:szCs w:val="18"/>
+        </w:rPr>
+        <w:t>Department of Computer Science Engineering and AI &amp; ML, JIS University, Kolkata, India</w:t>
       </w:r>
     </w:p>
     <w:p>
@@ -279,7 +250,14 @@
           <w:sz w:val="18"/>
           <w:szCs w:val="18"/>
         </w:rPr>
-        <w:t xml:space="preserve"> Blended Curricular Learning Resources (B-CLR), Michigan State University College of Human Medicine, East Lansing, Michigan, USA</w:t>
+        <w:t xml:space="preserve"> </w:t>
+      </w:r>
+      <w:r>
+        <w:rPr>
+          <w:sz w:val="18"/>
+          <w:szCs w:val="18"/>
+        </w:rPr>
+        <w:t>Department of Computer Science &amp; Business Systems, Institute of Engineering and Management, Kolkata, India</w:t>
       </w:r>
     </w:p>
     <w:p>
@@ -304,7 +282,14 @@
           <w:sz w:val="18"/>
           <w:szCs w:val="18"/>
         </w:rPr>
-        <w:t xml:space="preserve"> Center for Individualized Medicine, Mayo Clinic, Rochester, Minnesota, USA</w:t>
+        <w:t xml:space="preserve"> </w:t>
+      </w:r>
+      <w:r>
+        <w:rPr>
+          <w:sz w:val="18"/>
+          <w:szCs w:val="18"/>
+        </w:rPr>
+        <w:t>Department of Computer Science &amp; Business Systems, Institute of Engineering and Management, Kolkata, India</w:t>
       </w:r>
     </w:p>
     <w:p>
@@ -329,73 +314,14 @@
           <w:sz w:val="18"/>
           <w:szCs w:val="18"/>
         </w:rPr>
-        <w:t xml:space="preserve"> Department of Emergency Medicine, Rush University, Chicago, Illinois, USA</w:t>
-      </w:r>
-    </w:p>
-    <w:p>
-      <w:pPr>
-        <w:ind w:firstLine="0"/>
-        <w:jc w:val="left"/>
+        <w:t xml:space="preserve"> </w:t>
+      </w:r>
+      <w:r>
         <w:rPr>
           <w:sz w:val="18"/>
           <w:szCs w:val="18"/>
         </w:rPr>
-      </w:pPr>
-      <w:r>
-        <w:rPr>
-          <w:sz w:val="18"/>
-          <w:szCs w:val="18"/>
-          <w:vertAlign w:val="superscript"/>
-        </w:rPr>
-        <w:t>6</w:t>
-      </w:r>
-      <w:r>
-        <w:rPr>
-          <w:sz w:val="18"/>
-          <w:szCs w:val="18"/>
-        </w:rPr>
-        <w:t xml:space="preserve"> Graduate Medical Education Curriculum Development, Cleveland Clinic, OH</w:t>
-      </w:r>
-      <w:r>
-        <w:rPr>
-          <w:sz w:val="18"/>
-          <w:szCs w:val="18"/>
-        </w:rPr>
-        <w:t>, USA</w:t>
-      </w:r>
-      <w:bookmarkStart w:id="0" w:name="_GoBack"/>
-      <w:bookmarkEnd w:id="0"/>
-    </w:p>
-    <w:p>
-      <w:pPr>
-        <w:ind w:firstLine="0"/>
-        <w:jc w:val="left"/>
-        <w:rPr>
-          <w:sz w:val="18"/>
-          <w:szCs w:val="18"/>
-        </w:rPr>
-      </w:pPr>
-      <w:r>
-        <w:rPr>
-          <w:sz w:val="18"/>
-          <w:szCs w:val="18"/>
-          <w:vertAlign w:val="superscript"/>
-        </w:rPr>
-        <w:t>7</w:t>
-      </w:r>
-      <w:r>
-        <w:rPr>
-          <w:sz w:val="18"/>
-          <w:szCs w:val="18"/>
-        </w:rPr>
-        <w:t xml:space="preserve"> Department of Laboratory Medicine and Pathology, Mayo Clinic Rochester, MN</w:t>
-      </w:r>
-      <w:r>
-        <w:rPr>
-          <w:sz w:val="18"/>
-          <w:szCs w:val="18"/>
-        </w:rPr>
-        <w:t>, USA</w:t>
+        <w:t>Department of Computer Science Engineering, Institute of Engineering and Management, Kolkata, India</w:t>
       </w:r>
     </w:p>
     <w:p/>
@@ -417,15 +343,364 @@
     </w:p>
     <w:p>
       <w:pPr>
-        <w:pStyle w:val="Abstract"/>
-        <w:spacing w:line="264" w:lineRule="auto"/>
-      </w:pPr>
-      <w:r>
-        <w:t xml:space="preserve">Mobile learning has become a new learning modality, yet most practices of designing and developing mobile learning in medical education are often a theoretical with neither solid conceptual basis nor evidence-based instructional strategies. This paper aims to provide a literature review that investigates mobile learning instructional design strategies that were found to be effective in medical education. We conducted a literature search from 2010 to December 2015. An initial search yielded 1,196 articles, which were narrowed down to 28 papers for analysis based on exclusion and inclusion criteria. Adopting a qualitative synthesis methodology, we used an iterative data analysis approach using an inductive and deductive process to identify themes.  Studies were from various disciplines: Emergency medicine, surgery, pediatrics, nursing, pharmacology. The qualitative synthesis of literature suggested six themes. (1) Timeliness capturing learning experience and assessing performance: The focus of this mobile learning process is on capturing learning activities and providing feedback on the spot. (2) Pushed reminders for knowledge learning and behavior change: Using simple text messages were found to be effective and can be extended to a more sophisticated personalized scaffolding. (3) Visual modeling for performance just in time: This instructional strategy often involves reducing extraneous cognitive load on the spot, providing worked examples right before performing a critical task, and visualizing learning object in three dimensional presentations. (4) Facilitating collaborative informal learning: The underlying concept to support this mobile learning pedagogy is informal work-based learning and social learning process. (5) Mixed evidence of multimedia: There was no consistent evidence that multimedia such as videos is more effective than traditional media for knowledge learning. (6) Simulated immersive clinical experience: The underlying premise is that mobile simulations and gaming provide virtual immersive clinical experiences with opportunities for repeated practice at their fingertips </w:t>
-      </w:r>
-      <w:r>
-        <w:lastRenderedPageBreak/>
-        <w:t>without risk. These six themes are not exclusive, but combined to create optimized effective mobile learning experiences. These study findings provide that mobile learning is a pedagogical process enriched by context-sensitivity of being (location) and doing (activity) of a learner or a teacher. It is a comprehensive process to create meaningful instructional and learning interactions in consideration of where learners and teachers will be and what they will be doing. Simple transferring decontextualized traditional curriculum activities via a mobile device can have limited effectiveness. Future studies could focus on further applicability to various contexts in medical education.</w:t>
+        <w:ind w:firstLine="0"/>
+        <w:rPr>
+          <w:sz w:val="20"/>
+        </w:rPr>
+      </w:pPr>
+      <w:r>
+        <w:rPr>
+          <w:sz w:val="20"/>
+        </w:rPr>
+        <w:t>Deploying generative diffusion models on resource</w:t>
+      </w:r>
+      <w:r>
+        <w:rPr>
+          <w:sz w:val="20"/>
+        </w:rPr>
+        <w:t xml:space="preserve"> </w:t>
+      </w:r>
+      <w:r>
+        <w:rPr>
+          <w:sz w:val="20"/>
+        </w:rPr>
+        <w:t xml:space="preserve">constrained edge devices is severely bottlenecked by the </w:t>
+      </w:r>
+      <w:proofErr w:type="spellStart"/>
+      <w:r>
+        <w:rPr>
+          <w:sz w:val="20"/>
+        </w:rPr>
+        <w:t>memor</w:t>
+      </w:r>
+      <w:proofErr w:type="spellEnd"/>
+      <w:r>
+        <w:rPr>
+          <w:sz w:val="20"/>
+        </w:rPr>
+        <w:t xml:space="preserve"> </w:t>
+      </w:r>
+      <w:r>
+        <w:rPr>
+          <w:sz w:val="20"/>
+        </w:rPr>
+        <w:t>and computational costs of floating-point arithmetic. Whil</w:t>
+      </w:r>
+      <w:r>
+        <w:rPr>
+          <w:sz w:val="20"/>
+        </w:rPr>
+        <w:t xml:space="preserve">e </w:t>
+      </w:r>
+      <w:r>
+        <w:rPr>
+          <w:sz w:val="20"/>
+        </w:rPr>
+        <w:t>extreme 1</w:t>
+      </w:r>
+      <w:r>
+        <w:rPr>
+          <w:sz w:val="20"/>
+        </w:rPr>
+        <w:t xml:space="preserve"> </w:t>
+      </w:r>
+      <w:r>
+        <w:rPr>
+          <w:sz w:val="20"/>
+        </w:rPr>
+        <w:t>bit weight quantization offers an optimal solution,</w:t>
+      </w:r>
+      <w:r>
+        <w:rPr>
+          <w:sz w:val="20"/>
+        </w:rPr>
+        <w:t xml:space="preserve"> </w:t>
+      </w:r>
+      <w:r>
+        <w:rPr>
+          <w:sz w:val="20"/>
+        </w:rPr>
+        <w:t>current literature asserts that reducing</w:t>
+      </w:r>
+      <w:r>
+        <w:rPr>
+          <w:sz w:val="20"/>
+        </w:rPr>
+        <w:t xml:space="preserve"> </w:t>
+      </w:r>
+      <w:r>
+        <w:rPr>
+          <w:sz w:val="20"/>
+        </w:rPr>
+        <w:t>informational bandwidth</w:t>
+      </w:r>
+      <w:r>
+        <w:rPr>
+          <w:sz w:val="20"/>
+        </w:rPr>
+        <w:t xml:space="preserve"> </w:t>
+      </w:r>
+      <w:r>
+        <w:rPr>
+          <w:sz w:val="20"/>
+        </w:rPr>
+        <w:t>to this degree inevitably causes catastrophic manifold collapse.</w:t>
+      </w:r>
+      <w:r>
+        <w:rPr>
+          <w:sz w:val="20"/>
+        </w:rPr>
+        <w:t xml:space="preserve"> </w:t>
+      </w:r>
+      <w:r>
+        <w:rPr>
+          <w:sz w:val="20"/>
+        </w:rPr>
+        <w:t>We</w:t>
+      </w:r>
+      <w:r>
+        <w:rPr>
+          <w:sz w:val="20"/>
+        </w:rPr>
+        <w:t xml:space="preserve"> </w:t>
+      </w:r>
+      <w:r>
+        <w:rPr>
+          <w:sz w:val="20"/>
+        </w:rPr>
+        <w:t>challenge this consensus. In this paper, we demonstrate that</w:t>
+      </w:r>
+      <w:r>
+        <w:rPr>
+          <w:sz w:val="20"/>
+        </w:rPr>
+        <w:t xml:space="preserve"> </w:t>
+      </w:r>
+      <w:r>
+        <w:rPr>
+          <w:sz w:val="20"/>
+        </w:rPr>
+        <w:t>manifold collapse is not an inherent hardware penalty of the</w:t>
+      </w:r>
+      <w:r>
+        <w:rPr>
+          <w:sz w:val="20"/>
+        </w:rPr>
+        <w:t xml:space="preserve"> </w:t>
+      </w:r>
+      <w:r>
+        <w:rPr>
+          <w:sz w:val="20"/>
+        </w:rPr>
+        <w:t>1-bit boundary, but a fatal artifact of the standard Post-Training</w:t>
+      </w:r>
+      <w:r>
+        <w:rPr>
+          <w:sz w:val="20"/>
+        </w:rPr>
+        <w:t xml:space="preserve"> </w:t>
+      </w:r>
+      <w:r>
+        <w:rPr>
+          <w:sz w:val="20"/>
+        </w:rPr>
+        <w:t>Quantization (PTQ) paradigm. We introduce Native Binarization,</w:t>
+      </w:r>
+      <w:r>
+        <w:rPr>
+          <w:sz w:val="20"/>
+        </w:rPr>
+        <w:t xml:space="preserve"> </w:t>
+      </w:r>
+      <w:r>
+        <w:rPr>
+          <w:sz w:val="20"/>
+        </w:rPr>
+        <w:t>a framework that trains diffusion models entirely from scratch</w:t>
+      </w:r>
+      <w:r>
+        <w:rPr>
+          <w:sz w:val="20"/>
+        </w:rPr>
+        <w:t xml:space="preserve"> </w:t>
+      </w:r>
+      <w:r>
+        <w:rPr>
+          <w:sz w:val="20"/>
+        </w:rPr>
+        <w:t>using 1-bit weights, mean-centered scaling, and pre-activation</w:t>
+      </w:r>
+      <w:r>
+        <w:rPr>
+          <w:sz w:val="20"/>
+        </w:rPr>
+        <w:t xml:space="preserve"> </w:t>
+      </w:r>
+      <w:r>
+        <w:rPr>
+          <w:sz w:val="20"/>
+        </w:rPr>
+        <w:t>structures. We formalize two properties central to its success:</w:t>
+      </w:r>
+      <w:r>
+        <w:rPr>
+          <w:sz w:val="20"/>
+        </w:rPr>
+        <w:t xml:space="preserve"> </w:t>
+      </w:r>
+      <w:r>
+        <w:rPr>
+          <w:sz w:val="20"/>
+        </w:rPr>
+        <w:t>structural dominance—the preservation of dominant directional</w:t>
+      </w:r>
+      <w:r>
+        <w:rPr>
+          <w:sz w:val="20"/>
+        </w:rPr>
+        <w:t xml:space="preserve"> </w:t>
+      </w:r>
+      <w:r>
+        <w:rPr>
+          <w:sz w:val="20"/>
+        </w:rPr>
+        <w:t>weight geometry through centered binarization—and topological</w:t>
+      </w:r>
+      <w:r>
+        <w:rPr>
+          <w:sz w:val="20"/>
+        </w:rPr>
+        <w:t xml:space="preserve"> </w:t>
+      </w:r>
+      <w:r>
+        <w:rPr>
+          <w:sz w:val="20"/>
+        </w:rPr>
+        <w:t>stability—the capacity of the binary network to sustain manifold</w:t>
+      </w:r>
+      <w:r>
+        <w:rPr>
+          <w:sz w:val="20"/>
+        </w:rPr>
+        <w:t xml:space="preserve"> </w:t>
+      </w:r>
+      <w:r>
+        <w:rPr>
+          <w:sz w:val="20"/>
+        </w:rPr>
+        <w:t>integrity throughout training. Through a strict W1A16 hardware</w:t>
+      </w:r>
+      <w:r>
+        <w:rPr>
+          <w:sz w:val="20"/>
+        </w:rPr>
+        <w:t xml:space="preserve"> </w:t>
+      </w:r>
+      <w:r>
+        <w:rPr>
+          <w:sz w:val="20"/>
+        </w:rPr>
+        <w:t>ablation (binary weights, fixed full-precision activations), we prove</w:t>
+      </w:r>
+      <w:r>
+        <w:rPr>
+          <w:sz w:val="20"/>
+        </w:rPr>
+        <w:t xml:space="preserve"> </w:t>
+      </w:r>
+      <w:r>
+        <w:rPr>
+          <w:sz w:val="20"/>
+        </w:rPr>
+        <w:t>that while standard PTQ adaptation catastrophically destroys the</w:t>
+      </w:r>
+    </w:p>
+    <w:p>
+      <w:pPr>
+        <w:ind w:firstLine="0"/>
+        <w:rPr>
+          <w:sz w:val="20"/>
+        </w:rPr>
+      </w:pPr>
+      <w:r>
+        <w:rPr>
+          <w:sz w:val="20"/>
+        </w:rPr>
+        <w:t>generative topology (FID: 381.79, legibility: 0.00%), our natively</w:t>
+      </w:r>
+      <w:r>
+        <w:rPr>
+          <w:sz w:val="20"/>
+        </w:rPr>
+        <w:t xml:space="preserve"> </w:t>
+      </w:r>
+      <w:r>
+        <w:rPr>
+          <w:sz w:val="20"/>
+        </w:rPr>
+        <w:t>grown binary model maintains strict topological stability and</w:t>
+      </w:r>
+      <w:r>
+        <w:rPr>
+          <w:sz w:val="20"/>
+        </w:rPr>
+        <w:t xml:space="preserve"> </w:t>
+      </w:r>
+      <w:r>
+        <w:rPr>
+          <w:sz w:val="20"/>
+        </w:rPr>
+        <w:t>achieves functional parity with the unquantized FP16 baseline</w:t>
+      </w:r>
+    </w:p>
+    <w:p>
+      <w:pPr>
+        <w:ind w:firstLine="0"/>
+        <w:rPr>
+          <w:sz w:val="20"/>
+        </w:rPr>
+      </w:pPr>
+      <w:r>
+        <w:rPr>
+          <w:sz w:val="20"/>
+        </w:rPr>
+        <w:t>(FID: 24.22, legibility: 89.92%). These findings establish that 1-bit</w:t>
+      </w:r>
+      <w:r>
+        <w:rPr>
+          <w:sz w:val="20"/>
+        </w:rPr>
+        <w:t xml:space="preserve"> </w:t>
+      </w:r>
+      <w:r>
+        <w:rPr>
+          <w:sz w:val="20"/>
+        </w:rPr>
+        <w:t>diffusion manifolds are structurally sound when initialized natively,</w:t>
+      </w:r>
+      <w:r>
+        <w:rPr>
+          <w:sz w:val="20"/>
+        </w:rPr>
+        <w:t xml:space="preserve"> </w:t>
+      </w:r>
+      <w:r>
+        <w:rPr>
+          <w:sz w:val="20"/>
+        </w:rPr>
+        <w:t>unlocking a 32× memory reduction and 58× computational</w:t>
+      </w:r>
+      <w:r>
+        <w:rPr>
+          <w:sz w:val="20"/>
+        </w:rPr>
+        <w:t xml:space="preserve"> </w:t>
+      </w:r>
+      <w:r>
+        <w:rPr>
+          <w:sz w:val="20"/>
+        </w:rPr>
+        <w:t>speedup without sacrificing semantic utility.</w:t>
       </w:r>
     </w:p>
     <w:p/>
@@ -441,10 +716,43 @@
         <w:t>Keywords</w:t>
       </w:r>
       <w:r>
-        <w:t xml:space="preserve">: </w:t>
-      </w:r>
-      <w:r>
-        <w:t>literature review, mobile technologies, smart phones</w:t>
+        <w:t>:</w:t>
+      </w:r>
+      <w:r>
+        <w:t xml:space="preserve"> </w:t>
+      </w:r>
+      <w:r>
+        <w:t>1-Bit Quantization, Diffusion Models, Generative</w:t>
+      </w:r>
+      <w:r>
+        <w:t xml:space="preserve"> </w:t>
+      </w:r>
+      <w:r>
+        <w:t xml:space="preserve">AI, Model </w:t>
+      </w:r>
+      <w:proofErr w:type="spellStart"/>
+      <w:proofErr w:type="gramStart"/>
+      <w:r>
+        <w:t>Compression,Topology</w:t>
+      </w:r>
+      <w:proofErr w:type="spellEnd"/>
+      <w:proofErr w:type="gramEnd"/>
+      <w:r>
+        <w:t xml:space="preserve">, </w:t>
+      </w:r>
+      <w:proofErr w:type="spellStart"/>
+      <w:r>
+        <w:t>ResUNet</w:t>
+      </w:r>
+      <w:proofErr w:type="spellEnd"/>
+      <w:r>
+        <w:t>, Edge AI, Structural</w:t>
+      </w:r>
+      <w:r>
+        <w:t xml:space="preserve">, </w:t>
+      </w:r>
+      <w:r>
+        <w:t>Dominance, Binary Neural Networks</w:t>
       </w:r>
     </w:p>
     <w:p/>
@@ -471,39 +779,517 @@
     <w:p/>
     <w:p>
       <w:pPr>
+        <w:sectPr>
+          <w:headerReference w:type="even" r:id="rId8"/>
+          <w:headerReference w:type="default" r:id="rId9"/>
+          <w:headerReference w:type="first" r:id="rId10"/>
+          <w:footnotePr>
+            <w:numRestart w:val="eachSect"/>
+          </w:footnotePr>
+          <w:type w:val="oddPage"/>
+          <w:pgSz w:w="12240" w:h="15840" w:code="1"/>
+          <w:pgMar w:top="1620" w:right="2160" w:bottom="1980" w:left="2160" w:header="1044" w:footer="1404" w:gutter="0"/>
+          <w:cols w:space="720"/>
+          <w:titlePg/>
+        </w:sectPr>
+      </w:pPr>
+    </w:p>
+    <w:p>
+      <w:pPr>
+        <w:rPr>
+          <w:lang w:val="en-IN"/>
+        </w:rPr>
+      </w:pPr>
+      <w:r>
+        <w:rPr>
+          <w:lang w:val="en-IN"/>
+        </w:rPr>
+        <w:t>The unprecedented generative potential of denoising diffusion models has ushered in a paradigm shift in artificial intelligence. Denoising Diffusion Probabilistic Models (DDPMs) \cite{ho2020ddpm} now achieve state-of-the-art image synthesis quality across diverse domains, yet their utilization remains fundamentally dependent on high-performance floating-</w:t>
+      </w:r>
+      <w:r>
+        <w:rPr>
+          <w:lang w:val="en-IN"/>
+        </w:rPr>
+        <w:lastRenderedPageBreak/>
+        <w:t>point hardware. As the necessity for edge computing and on-device AI integration increases, the thermodynamic constraints of traditional floating-point arithmetic become a critical barrier: running a 1,000-step diffusion sampling loop on a mobile or IoT device under standard FP16 precision is presently intractable.</w:t>
+      </w:r>
+    </w:p>
+    <w:p>
+      <w:pPr>
+        <w:rPr>
+          <w:lang w:val="en-IN"/>
+        </w:rPr>
+      </w:pPr>
+    </w:p>
+    <w:p>
+      <w:pPr>
+        <w:rPr>
+          <w:lang w:val="en-IN"/>
+        </w:rPr>
+      </w:pPr>
+      <w:r>
+        <w:rPr>
+          <w:lang w:val="en-IN"/>
+        </w:rPr>
+        <w:t>Extreme quantization - specifically, 1-bit binarization, where 16-bit or 32-bit floating-point weights are compressed to a single bit - promises massive compression ratios and order-of-magnitude reductions in both memory and arithmetic operations. Binary weights permit replacing multiply-accumulate (MAC) operations with XNOR-</w:t>
+      </w:r>
+      <w:proofErr w:type="spellStart"/>
+      <w:r>
+        <w:rPr>
+          <w:lang w:val="en-IN"/>
+        </w:rPr>
+        <w:t>popcount</w:t>
+      </w:r>
+      <w:proofErr w:type="spellEnd"/>
+      <w:r>
+        <w:rPr>
+          <w:lang w:val="en-IN"/>
+        </w:rPr>
+        <w:t xml:space="preserve"> operations, which are dramatically cheaper in energy and silicon area. However, the general consensus in recent literature is that such extreme quantization is fundamentally incompatible with the complex data distributions required for diffusion-based generation. The latest state-of-the-art research on this topic - Binarized Diffusion Model (</w:t>
+      </w:r>
+      <w:proofErr w:type="spellStart"/>
+      <w:r>
+        <w:rPr>
+          <w:lang w:val="en-IN"/>
+        </w:rPr>
+        <w:t>BiDM</w:t>
+      </w:r>
+      <w:proofErr w:type="spellEnd"/>
+      <w:r>
+        <w:rPr>
+          <w:lang w:val="en-IN"/>
+        </w:rPr>
+        <w:t xml:space="preserve">) \cite{bidm2024}, published at </w:t>
+      </w:r>
+      <w:proofErr w:type="spellStart"/>
+      <w:r>
+        <w:rPr>
+          <w:lang w:val="en-IN"/>
+        </w:rPr>
+        <w:t>NeurIPS</w:t>
+      </w:r>
+      <w:proofErr w:type="spellEnd"/>
+      <w:r>
+        <w:rPr>
+          <w:lang w:val="en-IN"/>
+        </w:rPr>
+        <w:t xml:space="preserve"> 2024 - concluded that 1-bit binarization causes the generative manifold to catastrophically collapse, necessitating elaborate knowledge distillation from a full-precision teacher to recover generative utility.</w:t>
+      </w:r>
+    </w:p>
+    <w:p>
+      <w:pPr>
+        <w:rPr>
+          <w:lang w:val="en-IN"/>
+        </w:rPr>
+      </w:pPr>
+    </w:p>
+    <w:p>
+      <w:pPr>
+        <w:rPr>
+          <w:lang w:val="en-IN"/>
+        </w:rPr>
+      </w:pPr>
+      <w:r>
+        <w:rPr>
+          <w:lang w:val="en-IN"/>
+        </w:rPr>
+        <w:t xml:space="preserve">We contest this narrative. We contend that the topological destruction observed in prior work is not an inherent property of the 1-bit hardware boundary, but rather a critical flaw in the prevailing </w:t>
+      </w:r>
+      <w:r>
+        <w:rPr>
+          <w:b/>
+          <w:bCs/>
+          <w:lang w:val="en-IN"/>
+        </w:rPr>
+        <w:t>Post-Training Quantization (PTQ)</w:t>
+      </w:r>
+      <w:r>
+        <w:rPr>
+          <w:lang w:val="en-IN"/>
+        </w:rPr>
+        <w:t xml:space="preserve"> paradigm. The PTQ paradigm treats binarization as a </w:t>
+      </w:r>
+      <w:r>
+        <w:rPr>
+          <w:i/>
+          <w:iCs/>
+          <w:lang w:val="en-IN"/>
+        </w:rPr>
+        <w:t>compression problem</w:t>
+      </w:r>
+      <w:r>
+        <w:rPr>
+          <w:lang w:val="en-IN"/>
+        </w:rPr>
+        <w:t>: it takes a finely tuned FP16 diffusion model and truncates its weights to discrete binary states post-hoc. This "Train-then-Quantize" approach suddenly lobotomizes the finely optimized weight manifold, destroying the gradient signal pathways and producing the predictable result of structural collapse and abstract noise generation.</w:t>
+      </w:r>
+    </w:p>
+    <w:p>
+      <w:pPr>
+        <w:rPr>
+          <w:lang w:val="en-IN"/>
+        </w:rPr>
+      </w:pPr>
+    </w:p>
+    <w:p>
+      <w:pPr>
+        <w:rPr>
+          <w:lang w:val="en-IN"/>
+        </w:rPr>
+      </w:pPr>
+      <w:r>
+        <w:rPr>
+          <w:lang w:val="en-IN"/>
+        </w:rPr>
+        <w:t xml:space="preserve">In this paper, we propose a paradigm shift from PTQ to </w:t>
+      </w:r>
+      <w:r>
+        <w:rPr>
+          <w:b/>
+          <w:bCs/>
+          <w:lang w:val="en-IN"/>
+        </w:rPr>
+        <w:t>Native Binarization</w:t>
+      </w:r>
+      <w:r>
+        <w:rPr>
+          <w:lang w:val="en-IN"/>
+        </w:rPr>
+        <w:t xml:space="preserve"> - reframing binarization as a </w:t>
+      </w:r>
+      <w:r>
+        <w:rPr>
+          <w:i/>
+          <w:iCs/>
+          <w:lang w:val="en-IN"/>
+        </w:rPr>
+        <w:t>representation problem</w:t>
+      </w:r>
+      <w:r>
+        <w:rPr>
+          <w:lang w:val="en-IN"/>
+        </w:rPr>
+        <w:t xml:space="preserve"> rather than a compression problem. We hypothesize that a functional binary generative manifold can be grown if the network is initialized and trained entirely within binary constraints from the first step. Rather than adapting a pre-trained floating-point teacher, our architecture is trained from scratch with 1-bit weights using two core mechanisms: (1) </w:t>
+      </w:r>
+      <w:r>
+        <w:rPr>
+          <w:b/>
+          <w:bCs/>
+          <w:lang w:val="en-IN"/>
+        </w:rPr>
+        <w:t>mean-</w:t>
+      </w:r>
+      <w:proofErr w:type="spellStart"/>
+      <w:r>
+        <w:rPr>
+          <w:b/>
+          <w:bCs/>
+          <w:lang w:val="en-IN"/>
+        </w:rPr>
+        <w:t>centered</w:t>
+      </w:r>
+      <w:proofErr w:type="spellEnd"/>
+      <w:r>
+        <w:rPr>
+          <w:b/>
+          <w:bCs/>
+          <w:lang w:val="en-IN"/>
+        </w:rPr>
+        <w:t xml:space="preserve"> weight scaling</w:t>
+      </w:r>
+      <w:r>
+        <w:rPr>
+          <w:lang w:val="en-IN"/>
+        </w:rPr>
+        <w:t xml:space="preserve"> that enforces </w:t>
+      </w:r>
+      <w:r>
+        <w:rPr>
+          <w:i/>
+          <w:iCs/>
+          <w:lang w:val="en-IN"/>
+        </w:rPr>
+        <w:t>structural dominance</w:t>
+      </w:r>
+      <w:r>
+        <w:rPr>
+          <w:lang w:val="en-IN"/>
+        </w:rPr>
+        <w:t xml:space="preserve"> - the property that the binary weight approximation captures the dominant directional structure of the weight space - and (2) </w:t>
+      </w:r>
+      <w:r>
+        <w:rPr>
+          <w:b/>
+          <w:bCs/>
+          <w:lang w:val="en-IN"/>
+        </w:rPr>
+        <w:t>pre-activation residual ordering</w:t>
+      </w:r>
+      <w:r>
+        <w:rPr>
+          <w:lang w:val="en-IN"/>
+        </w:rPr>
+        <w:t xml:space="preserve"> (BN → Act → Conv) that maintains </w:t>
+      </w:r>
+      <w:r>
+        <w:rPr>
+          <w:i/>
+          <w:iCs/>
+          <w:lang w:val="en-IN"/>
+        </w:rPr>
+        <w:t>topological stability</w:t>
+      </w:r>
+      <w:r>
+        <w:rPr>
+          <w:i/>
+          <w:iCs/>
+          <w:lang w:val="en-IN"/>
+        </w:rPr>
+        <w:t xml:space="preserve"> </w:t>
+      </w:r>
+      <w:r>
+        <w:rPr>
+          <w:lang w:val="en-IN"/>
+        </w:rPr>
+        <w:t xml:space="preserve"> by ensuring correct gradient flow through binary sign functions throughout training.</w:t>
+      </w:r>
+    </w:p>
+    <w:p>
+      <w:pPr>
+        <w:rPr>
+          <w:lang w:val="en-IN"/>
+        </w:rPr>
+      </w:pPr>
+    </w:p>
+    <w:p>
+      <w:pPr>
+        <w:rPr>
+          <w:lang w:val="en-IN"/>
+        </w:rPr>
+      </w:pPr>
+      <w:r>
+        <w:rPr>
+          <w:lang w:val="en-IN"/>
+        </w:rPr>
+        <w:t>To rigorously validate this paradigm shift, we provide a strict hardware ablation study with activation precision fixed at FP16 (the W1A16 regime), isolating the effects of the weight binarization methodology alone. Our results definitively prove that standard PTQ adaptation completely destroys generative topology at the 1-bit boundary (FID: 381.79, legibility: 0.00%), while Native Binarization achieves functional and topological parity with the FP16 baseline (FID: 24.22, legibility: 89.92%). This approach successfully removes 95% of the model's informational bandwidth, creating a diffusion architecture that is 32× smaller, 58× faster in binary operations, and eliminates the problem of manifold collapse.</w:t>
+      </w:r>
+    </w:p>
+    <w:p>
+      <w:pPr>
+        <w:rPr>
+          <w:lang w:val="en-IN"/>
+        </w:rPr>
+      </w:pPr>
+    </w:p>
+    <w:p>
+      <w:pPr>
+        <w:rPr>
+          <w:lang w:val="en-IN"/>
+        </w:rPr>
+      </w:pPr>
+      <w:r>
+        <w:rPr>
+          <w:b/>
+          <w:bCs/>
+          <w:lang w:val="en-IN"/>
+        </w:rPr>
+        <w:lastRenderedPageBreak/>
+        <w:t>Contributions:</w:t>
+      </w:r>
+      <w:r>
+        <w:rPr>
+          <w:lang w:val="en-IN"/>
+        </w:rPr>
+        <w:t xml:space="preserve"> This paper makes the following contributions:</w:t>
+      </w:r>
+    </w:p>
+    <w:p>
+      <w:pPr>
+        <w:rPr>
+          <w:lang w:val="en-IN"/>
+        </w:rPr>
+      </w:pPr>
+    </w:p>
+    <w:p>
+      <w:pPr>
+        <w:pStyle w:val="ListParagraph"/>
+        <w:numPr>
+          <w:ilvl w:val="0"/>
+          <w:numId w:val="11"/>
+        </w:numPr>
+        <w:rPr>
+          <w:lang w:val="en-IN"/>
+        </w:rPr>
+      </w:pPr>
+      <w:r>
+        <w:rPr>
+          <w:lang w:val="en-IN"/>
+        </w:rPr>
+        <w:t xml:space="preserve">We formalize the concepts of </w:t>
+      </w:r>
+      <w:r>
+        <w:rPr>
+          <w:b/>
+          <w:bCs/>
+          <w:lang w:val="en-IN"/>
+        </w:rPr>
+        <w:t>structural dominance</w:t>
+      </w:r>
+      <w:r>
+        <w:rPr>
+          <w:lang w:val="en-IN"/>
+        </w:rPr>
+        <w:t xml:space="preserve"> and </w:t>
+      </w:r>
+      <w:r>
+        <w:rPr>
+          <w:b/>
+          <w:bCs/>
+          <w:lang w:val="en-IN"/>
+        </w:rPr>
+        <w:t>topological stability</w:t>
+      </w:r>
+      <w:r>
+        <w:rPr>
+          <w:lang w:val="en-IN"/>
+        </w:rPr>
+        <w:t xml:space="preserve"> in binary diffusion models, providing a theoretical basis for why </w:t>
+      </w:r>
+      <w:proofErr w:type="spellStart"/>
+      <w:r>
+        <w:rPr>
+          <w:lang w:val="en-IN"/>
+        </w:rPr>
+        <w:t>centered</w:t>
+      </w:r>
+      <w:proofErr w:type="spellEnd"/>
+      <w:r>
+        <w:rPr>
+          <w:lang w:val="en-IN"/>
+        </w:rPr>
+        <w:t xml:space="preserve"> weight binarization and pre-activation ordering succeed where PTQ fails.</w:t>
+      </w:r>
+    </w:p>
+    <w:p>
+      <w:pPr>
         <w:ind w:firstLine="0"/>
         <w:rPr>
-          <w:noProof/>
-        </w:rPr>
-      </w:pPr>
-      <w:r>
-        <w:t>For the last decade, the concept of mobile learning has been discussed and defined from various perspectives. From the perspective of technical attributes, mobile learning can be defined as learning that makes use of mobile technologies (Sharples, 2000). This techno-centric perspective focuses on the physical aspect of technologies; that is, the hardware, the software, and specific characteristics of mobile devices. This view has been challenged and has evolved to include a broader understanding of the technological phenomenon with an increased focus on the nature of ubiquitous learning embracing seamless learning context (Toh et al., 2013; El-Hussein and Cronje, 2010; Traxler, 2007).  In this view, mobile learning is defined as a meaningful learning process “that occurs when learners have access to information anytime and anywhere via mobile technologies to perform authentic activities in the context of their learning” (p.77, Martin and Ertzberger, 2013).</w:t>
-      </w:r>
-      <w:r>
-        <w:rPr>
-          <w:noProof/>
-        </w:rPr>
-        <w:t>Nunc viverra imperdiet enim. Fusce est. Vivamus a tellus.</w:t>
-      </w:r>
-    </w:p>
-    <w:p>
-      <w:r>
-        <w:t xml:space="preserve">The notion of ubiquitous mobile learning </w:t>
-      </w:r>
-      <w:r>
-        <w:sym w:font="Symbol" w:char="F02D"/>
-      </w:r>
-      <w:r>
-        <w:t xml:space="preserve"> learning anywhere and anytime </w:t>
-      </w:r>
-      <w:r>
-        <w:sym w:font="Symbol" w:char="F02D"/>
-      </w:r>
-      <w:r>
-        <w:t xml:space="preserve"> indicates a pragmatic understanding of learning experiences especially in an informal format that happens beyond classroom settings and resides in daily activities (Merriam and Bierema, 2014). The majority of adults engage in hundreds of hours of informal learning (Caffarella and Merriam, 2012); therefore, a unique aspect of mobile learning is that it is a “personal, contextual, and situated” learning process, especially emphasizing individuals’ informal and unstructured experiences (Traxler, 2007). Recognizing the disruptive nature of mobile learning regardless of location and time, it is imperative to understand what design strategies and approaches have been found to be effective in mobile learning. </w:t>
-      </w:r>
-    </w:p>
-    <w:p/>
+          <w:lang w:val="en-IN"/>
+        </w:rPr>
+      </w:pPr>
+    </w:p>
+    <w:p>
+      <w:pPr>
+        <w:pStyle w:val="ListParagraph"/>
+        <w:numPr>
+          <w:ilvl w:val="0"/>
+          <w:numId w:val="11"/>
+        </w:numPr>
+        <w:rPr>
+          <w:lang w:val="en-IN"/>
+        </w:rPr>
+      </w:pPr>
+      <w:r>
+        <w:rPr>
+          <w:lang w:val="en-IN"/>
+        </w:rPr>
+        <w:t xml:space="preserve">We introduce </w:t>
+      </w:r>
+      <w:r>
+        <w:rPr>
+          <w:b/>
+          <w:bCs/>
+          <w:lang w:val="en-IN"/>
+        </w:rPr>
+        <w:t>Native Binarization</w:t>
+      </w:r>
+      <w:r>
+        <w:rPr>
+          <w:lang w:val="en-IN"/>
+        </w:rPr>
+        <w:t>, a training-from-scratch framework for 1-bit diffusion models that requires no teacher model and no knowledge distillation.</w:t>
+      </w:r>
+    </w:p>
+    <w:p>
+      <w:pPr>
+        <w:ind w:firstLine="0"/>
+        <w:rPr>
+          <w:lang w:val="en-IN"/>
+        </w:rPr>
+      </w:pPr>
+    </w:p>
+    <w:p>
+      <w:pPr>
+        <w:pStyle w:val="ListParagraph"/>
+        <w:numPr>
+          <w:ilvl w:val="0"/>
+          <w:numId w:val="11"/>
+        </w:numPr>
+        <w:rPr>
+          <w:lang w:val="en-IN"/>
+        </w:rPr>
+      </w:pPr>
+      <w:r>
+        <w:rPr>
+          <w:lang w:val="en-IN"/>
+        </w:rPr>
+        <w:t xml:space="preserve">We conduct a strict </w:t>
+      </w:r>
+      <w:r>
+        <w:rPr>
+          <w:b/>
+          <w:bCs/>
+          <w:lang w:val="en-IN"/>
+        </w:rPr>
+        <w:t>W1A16 hardware ablation</w:t>
+      </w:r>
+      <w:r>
+        <w:rPr>
+          <w:lang w:val="en-IN"/>
+        </w:rPr>
+        <w:t xml:space="preserve"> that definitively isolates the effect of binarization methodology from activation quantization noise, producing the first clean comparison between PTQ and native training at the 1-bit weight boundary.</w:t>
+      </w:r>
+    </w:p>
+    <w:p>
+      <w:pPr>
+        <w:ind w:firstLine="0"/>
+        <w:rPr>
+          <w:lang w:val="en-IN"/>
+        </w:rPr>
+      </w:pPr>
+    </w:p>
+    <w:p>
+      <w:pPr>
+        <w:pStyle w:val="ListParagraph"/>
+        <w:numPr>
+          <w:ilvl w:val="0"/>
+          <w:numId w:val="11"/>
+        </w:numPr>
+        <w:rPr>
+          <w:lang w:val="en-IN"/>
+        </w:rPr>
+      </w:pPr>
+      <w:r>
+        <w:rPr>
+          <w:lang w:val="en-IN"/>
+        </w:rPr>
+        <w:t>We report a comprehensive evaluation across FP16, W1A16, and W1A1 regimes using two complementary metrics - FID and a Legibility Score - demonstrating that topological stability is measurable and preserved under native binary training.</w:t>
+      </w:r>
+    </w:p>
+    <w:p>
+      <w:pPr>
+        <w:sectPr>
+          <w:footnotePr>
+            <w:numRestart w:val="eachSect"/>
+          </w:footnotePr>
+          <w:type w:val="continuous"/>
+          <w:pgSz w:w="12240" w:h="15840" w:code="1"/>
+          <w:pgMar w:top="1620" w:right="2160" w:bottom="1980" w:left="2160" w:header="1044" w:footer="1404" w:gutter="0"/>
+          <w:cols w:space="720"/>
+          <w:titlePg/>
+        </w:sectPr>
+      </w:pPr>
+    </w:p>
     <w:p/>
     <w:p>
       <w:pPr>
@@ -520,39 +1306,19 @@
           <w:sz w:val="22"/>
           <w:szCs w:val="22"/>
         </w:rPr>
-        <w:t xml:space="preserve">Mobile Learning Literature Review </w:t>
-      </w:r>
-      <w:r>
+        <w:t>Related Works</w:t>
+      </w:r>
+    </w:p>
+    <w:p>
+      <w:pPr>
+        <w:ind w:firstLine="0"/>
         <w:rPr>
           <w:b/>
           <w:sz w:val="22"/>
           <w:szCs w:val="22"/>
         </w:rPr>
-        <w:t>i</w:t>
-      </w:r>
-      <w:r>
-        <w:rPr>
-          <w:b/>
-          <w:sz w:val="22"/>
-          <w:szCs w:val="22"/>
-        </w:rPr>
-        <w:t>n Medical Education</w:t>
-      </w:r>
-    </w:p>
-    <w:p>
-      <w:pPr>
-        <w:ind w:firstLine="0"/>
-      </w:pPr>
-    </w:p>
-    <w:p>
-      <w:pPr>
-        <w:ind w:firstLine="0"/>
-      </w:pPr>
-      <w:r>
-        <w:t xml:space="preserve">The recent influx of mobile technologies such as smart phones and tablet computers has profoundly influenced people’s daily activities. As mobile devices continue to diminish in size, their computing capacity is expanding at unprecedented rates providing users with increased on-the-go access, powerful information processing capabilities, and social opportunities. This mobility and instant connectivity phenomenon changes not only how people interact and share information but also presents educational opportunities across fields and academic levels—hence the coining of the term mobile learning.  </w:t>
-      </w:r>
-    </w:p>
-    <w:p/>
+      </w:pPr>
+    </w:p>
     <w:p>
       <w:pPr>
         <w:ind w:firstLine="0"/>
@@ -562,31 +1328,742 @@
           <w:iCs/>
           <w:sz w:val="22"/>
           <w:szCs w:val="22"/>
-        </w:rPr>
-      </w:pPr>
-      <w:r>
+          <w:lang w:val="en-IN"/>
+        </w:rPr>
+      </w:pPr>
+      <w:r>
+        <w:rPr>
+          <w:b/>
+          <w:bCs/>
+          <w:i/>
+          <w:iCs/>
+          <w:sz w:val="22"/>
+          <w:szCs w:val="22"/>
+          <w:lang w:val="en-IN"/>
+        </w:rPr>
+        <w:t>Diffusion Models and Edge Deployment</w:t>
+      </w:r>
+    </w:p>
+    <w:p>
+      <w:pPr>
+        <w:ind w:firstLine="0"/>
+      </w:pPr>
+    </w:p>
+    <w:p>
+      <w:pPr>
+        <w:rPr>
+          <w:lang w:val="en-IN"/>
+        </w:rPr>
+      </w:pPr>
+      <w:r>
+        <w:rPr>
+          <w:lang w:val="en-IN"/>
+        </w:rPr>
+        <w:t xml:space="preserve">DDPMs \cite{ho2020ddpm} define a forward Markov process that gradually corrupts data with Gaussian noise over T steps, and learn a reverse denoising network </w:t>
+      </w:r>
+      <w:proofErr w:type="spellStart"/>
+      <w:r>
+        <w:rPr>
+          <w:lang w:val="en-IN"/>
+        </w:rPr>
+        <w:t>fθ</w:t>
+      </w:r>
+      <w:proofErr w:type="spellEnd"/>
+      <w:r>
+        <w:rPr>
+          <w:lang w:val="en-IN"/>
+        </w:rPr>
+        <w:t xml:space="preserve"> to reconstruct clean images. The training objective is:</w:t>
+      </w:r>
+    </w:p>
+    <w:p>
+      <w:pPr>
+        <w:rPr>
+          <w:lang w:val="en-IN"/>
+        </w:rPr>
+      </w:pPr>
+    </w:p>
+    <w:p>
+      <w:pPr>
+        <w:rPr>
+          <w:lang w:val="en-IN"/>
+        </w:rPr>
+      </w:pPr>
+      <w:r>
+        <w:rPr>
+          <w:lang w:val="en-IN"/>
+        </w:rPr>
+        <w:t>$$\</w:t>
+      </w:r>
+      <w:proofErr w:type="spellStart"/>
+      <w:r>
+        <w:rPr>
+          <w:lang w:val="en-IN"/>
+        </w:rPr>
+        <w:t>mathcal</w:t>
+      </w:r>
+      <w:proofErr w:type="spellEnd"/>
+      <w:r>
+        <w:rPr>
+          <w:lang w:val="en-IN"/>
+        </w:rPr>
+        <w:t>{L} = \</w:t>
+      </w:r>
+      <w:proofErr w:type="spellStart"/>
+      <w:r>
+        <w:rPr>
+          <w:lang w:val="en-IN"/>
+        </w:rPr>
+        <w:t>mathbb</w:t>
+      </w:r>
+      <w:proofErr w:type="spellEnd"/>
+      <w:r>
+        <w:rPr>
+          <w:lang w:val="en-IN"/>
+        </w:rPr>
+        <w:t>{E}</w:t>
+      </w:r>
+      <w:proofErr w:type="gramStart"/>
+      <w:r>
+        <w:rPr>
+          <w:lang w:val="en-IN"/>
+        </w:rPr>
+        <w:t>_{</w:t>
+      </w:r>
+      <w:proofErr w:type="gramEnd"/>
+      <w:r>
+        <w:rPr>
+          <w:lang w:val="en-IN"/>
+        </w:rPr>
+        <w:t>x_0, \</w:t>
+      </w:r>
+      <w:proofErr w:type="spellStart"/>
+      <w:r>
+        <w:rPr>
+          <w:lang w:val="en-IN"/>
+        </w:rPr>
+        <w:t>varepsilon</w:t>
+      </w:r>
+      <w:proofErr w:type="spellEnd"/>
+      <w:r>
+        <w:rPr>
+          <w:lang w:val="en-IN"/>
+        </w:rPr>
+        <w:t xml:space="preserve">, </w:t>
+      </w:r>
+      <w:proofErr w:type="gramStart"/>
+      <w:r>
+        <w:rPr>
+          <w:lang w:val="en-IN"/>
+        </w:rPr>
+        <w:t>t}\</w:t>
+      </w:r>
+      <w:proofErr w:type="gramEnd"/>
+      <w:r>
+        <w:rPr>
+          <w:lang w:val="en-IN"/>
+        </w:rPr>
+        <w:t>!\</w:t>
+      </w:r>
+      <w:proofErr w:type="gramStart"/>
+      <w:r>
+        <w:rPr>
+          <w:lang w:val="en-IN"/>
+        </w:rPr>
+        <w:t>left[</w:t>
+      </w:r>
+      <w:proofErr w:type="gramEnd"/>
+      <w:r>
+        <w:rPr>
+          <w:lang w:val="en-IN"/>
+        </w:rPr>
+        <w:t>\left\|\</w:t>
+      </w:r>
+      <w:proofErr w:type="spellStart"/>
+      <w:r>
+        <w:rPr>
+          <w:lang w:val="en-IN"/>
+        </w:rPr>
+        <w:t>varepsilon</w:t>
+      </w:r>
+      <w:proofErr w:type="spellEnd"/>
+      <w:r>
+        <w:rPr>
+          <w:lang w:val="en-IN"/>
+        </w:rPr>
+        <w:t xml:space="preserve"> - f_</w:t>
+      </w:r>
+      <w:proofErr w:type="gramStart"/>
+      <w:r>
+        <w:rPr>
+          <w:lang w:val="en-IN"/>
+        </w:rPr>
+        <w:t>\theta\!\</w:t>
+      </w:r>
+      <w:proofErr w:type="gramEnd"/>
+      <w:r>
+        <w:rPr>
+          <w:lang w:val="en-IN"/>
+        </w:rPr>
+        <w:t>left(\sqrt{</w:t>
+      </w:r>
+      <w:proofErr w:type="gramStart"/>
+      <w:r>
+        <w:rPr>
+          <w:lang w:val="en-IN"/>
+        </w:rPr>
+        <w:t>\bar\</w:t>
+      </w:r>
+      <w:proofErr w:type="spellStart"/>
+      <w:r>
+        <w:rPr>
+          <w:lang w:val="en-IN"/>
+        </w:rPr>
+        <w:t>alpha_t</w:t>
+      </w:r>
+      <w:proofErr w:type="spellEnd"/>
+      <w:r>
+        <w:rPr>
+          <w:lang w:val="en-IN"/>
+        </w:rPr>
+        <w:t>}\</w:t>
+      </w:r>
+      <w:proofErr w:type="gramEnd"/>
+      <w:r>
+        <w:rPr>
+          <w:lang w:val="en-IN"/>
+        </w:rPr>
+        <w:t>,x_0 + \sqrt{1-</w:t>
+      </w:r>
+      <w:proofErr w:type="gramStart"/>
+      <w:r>
+        <w:rPr>
+          <w:lang w:val="en-IN"/>
+        </w:rPr>
+        <w:t>\bar\</w:t>
+      </w:r>
+      <w:proofErr w:type="spellStart"/>
+      <w:r>
+        <w:rPr>
+          <w:lang w:val="en-IN"/>
+        </w:rPr>
+        <w:t>alpha_t</w:t>
+      </w:r>
+      <w:proofErr w:type="spellEnd"/>
+      <w:r>
+        <w:rPr>
+          <w:lang w:val="en-IN"/>
+        </w:rPr>
+        <w:t>}\</w:t>
+      </w:r>
+      <w:proofErr w:type="gramEnd"/>
+      <w:r>
+        <w:rPr>
+          <w:lang w:val="en-IN"/>
+        </w:rPr>
+        <w:t>,\</w:t>
+      </w:r>
+      <w:proofErr w:type="spellStart"/>
+      <w:proofErr w:type="gramStart"/>
+      <w:r>
+        <w:rPr>
+          <w:lang w:val="en-IN"/>
+        </w:rPr>
+        <w:t>varepsilon</w:t>
+      </w:r>
+      <w:proofErr w:type="spellEnd"/>
+      <w:r>
+        <w:rPr>
+          <w:lang w:val="en-IN"/>
+        </w:rPr>
+        <w:t>,\</w:t>
+      </w:r>
+      <w:proofErr w:type="gramEnd"/>
+      <w:r>
+        <w:rPr>
+          <w:lang w:val="en-IN"/>
+        </w:rPr>
+        <w:t>;t\</w:t>
+      </w:r>
+      <w:proofErr w:type="gramStart"/>
+      <w:r>
+        <w:rPr>
+          <w:lang w:val="en-IN"/>
+        </w:rPr>
+        <w:t>right)\right\</w:t>
+      </w:r>
+      <w:proofErr w:type="gramEnd"/>
+      <w:r>
+        <w:rPr>
+          <w:lang w:val="en-IN"/>
+        </w:rPr>
+        <w:t>|^2\</w:t>
+      </w:r>
+      <w:proofErr w:type="gramStart"/>
+      <w:r>
+        <w:rPr>
+          <w:lang w:val="en-IN"/>
+        </w:rPr>
+        <w:t>right]$</w:t>
+      </w:r>
+      <w:proofErr w:type="gramEnd"/>
+      <w:r>
+        <w:rPr>
+          <w:lang w:val="en-IN"/>
+        </w:rPr>
+        <w:t>$</w:t>
+      </w:r>
+    </w:p>
+    <w:p>
+      <w:pPr>
+        <w:rPr>
+          <w:lang w:val="en-IN"/>
+        </w:rPr>
+      </w:pPr>
+    </w:p>
+    <w:p>
+      <w:pPr>
+        <w:rPr>
+          <w:lang w:val="en-IN"/>
+        </w:rPr>
+      </w:pPr>
+      <w:r>
+        <w:rPr>
+          <w:lang w:val="en-IN"/>
+        </w:rPr>
+        <w:t>where $\bar\</w:t>
+      </w:r>
+      <w:proofErr w:type="spellStart"/>
+      <w:r>
+        <w:rPr>
+          <w:lang w:val="en-IN"/>
+        </w:rPr>
+        <w:t>alpha_t</w:t>
+      </w:r>
+      <w:proofErr w:type="spellEnd"/>
+      <w:r>
+        <w:rPr>
+          <w:lang w:val="en-IN"/>
+        </w:rPr>
+        <w:t xml:space="preserve"> = \prod_{</w:t>
+      </w:r>
+      <w:proofErr w:type="spellStart"/>
+      <w:r>
+        <w:rPr>
+          <w:lang w:val="en-IN"/>
+        </w:rPr>
+        <w:t>i</w:t>
+      </w:r>
+      <w:proofErr w:type="spellEnd"/>
+      <w:r>
+        <w:rPr>
+          <w:lang w:val="en-IN"/>
+        </w:rPr>
+        <w:t>=</w:t>
+      </w:r>
+      <w:proofErr w:type="gramStart"/>
+      <w:r>
+        <w:rPr>
+          <w:lang w:val="en-IN"/>
+        </w:rPr>
+        <w:t>1}^</w:t>
+      </w:r>
+      <w:proofErr w:type="gramEnd"/>
+      <w:r>
+        <w:rPr>
+          <w:lang w:val="en-IN"/>
+        </w:rPr>
+        <w:t>t (1 - \</w:t>
+      </w:r>
+      <w:proofErr w:type="spellStart"/>
+      <w:r>
+        <w:rPr>
+          <w:lang w:val="en-IN"/>
+        </w:rPr>
+        <w:t>beta_</w:t>
+      </w:r>
+      <w:proofErr w:type="gramStart"/>
+      <w:r>
+        <w:rPr>
+          <w:lang w:val="en-IN"/>
+        </w:rPr>
+        <w:t>i</w:t>
+      </w:r>
+      <w:proofErr w:type="spellEnd"/>
+      <w:r>
+        <w:rPr>
+          <w:lang w:val="en-IN"/>
+        </w:rPr>
+        <w:t>)$</w:t>
+      </w:r>
+      <w:proofErr w:type="gramEnd"/>
+      <w:r>
+        <w:rPr>
+          <w:lang w:val="en-IN"/>
+        </w:rPr>
+        <w:t>. Subsequent improvements (DDIM \cite{song2020ddim}, LDM \cite{rombach2022ldm}, SDXL \cite{podell2023sdxl}) have extended generation quality dramatically, but all share the inference bottleneck of hundreds to thousands of sequential network evaluations. Efforts to make diffusion models edge-deployable have focused primarily on sampling efficiency (fewer steps via distillation \cite{salimans2022progressive}) or architectural pruning, but these do not address the fundamental precision cost of floating-point arithmetic.</w:t>
+      </w:r>
+    </w:p>
+    <w:p/>
+    <w:p>
+      <w:pPr>
+        <w:ind w:firstLine="0"/>
         <w:rPr>
           <w:b/>
           <w:i/>
           <w:iCs/>
           <w:sz w:val="22"/>
           <w:szCs w:val="22"/>
-        </w:rPr>
-        <w:t xml:space="preserve">Pushed Reminders For Knowledge Learning And Behavior Change </w:t>
-      </w:r>
+          <w:lang w:val="en-IN"/>
+        </w:rPr>
+      </w:pPr>
+      <w:r>
+        <w:rPr>
+          <w:b/>
+          <w:bCs/>
+          <w:i/>
+          <w:iCs/>
+          <w:sz w:val="22"/>
+          <w:szCs w:val="22"/>
+          <w:lang w:val="en-IN"/>
+        </w:rPr>
+        <w:t>Post-Training Quantization and Its Limits</w:t>
+      </w:r>
+    </w:p>
+    <w:p>
+      <w:pPr>
+        <w:rPr>
+          <w:lang w:val="en-IN"/>
+        </w:rPr>
+      </w:pPr>
+      <w:r>
+        <w:rPr>
+          <w:lang w:val="en-IN"/>
+        </w:rPr>
+        <w:lastRenderedPageBreak/>
+        <w:t xml:space="preserve">Post-Training Quantization (PTQ) compresses a pre-trained model by mapping its floating-point parameters to a lower-bit representation without retraining. Q-Diffusion \cite{li2023qdiffusion} and PTQD \cite{he2023ptqd} demonstrated PTQ of diffusion models to 4-bit and 8-bit precision with acceptable quality degradation. </w:t>
+      </w:r>
+      <w:proofErr w:type="spellStart"/>
+      <w:r>
+        <w:rPr>
+          <w:lang w:val="en-IN"/>
+        </w:rPr>
+        <w:t>EfficientDiffusion</w:t>
+      </w:r>
+      <w:proofErr w:type="spellEnd"/>
+      <w:r>
+        <w:rPr>
+          <w:lang w:val="en-IN"/>
+        </w:rPr>
+        <w:t xml:space="preserve"> and TDQ introduced timestep-aware quantization calibration to handle the fact that activation distributions in diffusion models shift significantly across timesteps, making a single fixed quantization scale suboptimal.</w:t>
+      </w:r>
+    </w:p>
+    <w:p>
+      <w:pPr>
+        <w:rPr>
+          <w:lang w:val="en-IN"/>
+        </w:rPr>
+      </w:pPr>
+    </w:p>
+    <w:p>
+      <w:pPr>
+        <w:rPr>
+          <w:lang w:val="en-IN"/>
+        </w:rPr>
+      </w:pPr>
+      <w:r>
+        <w:rPr>
+          <w:lang w:val="en-IN"/>
+        </w:rPr>
+        <w:t>However, PTQ degrades sharply as bit-width decreases. At 1-bit precision, the quantization error is so large relative to the weight magnitude that the pre-trained solution manifold cannot be preserved: the binary approximation of each floating-point weight is a fundamentally different object from the original, and the entire network's learned computation is disrupted. Our empirical results confirm this catastrophically at 1-bit (FID: 381.79, legibility: 0.00%) for a W1A16 PTQ model.</w:t>
+      </w:r>
+    </w:p>
+    <w:p>
+      <w:pPr>
+        <w:rPr>
+          <w:lang w:val="en-IN"/>
+        </w:rPr>
+      </w:pPr>
     </w:p>
     <w:p>
       <w:pPr>
         <w:ind w:firstLine="0"/>
-      </w:pPr>
-      <w:r>
-        <w:t xml:space="preserve">Pushed information or reminders using simple text messages were found to be effective in enhancing medical learners’ knowledge acquisition and retention (Chuang and Tsao, 2013; Diedhiou et al., 2015; Walter et al., 2014; Alipour, Jannat and Hosseini, 2014). </w:t>
-      </w:r>
-    </w:p>
-    <w:p>
-      <w:r>
-        <w:t xml:space="preserve">In a study in nursing education, students provided with SMS learning resources two times a day showed higher scores in a medical knowledge test than those without SMS observed at one week, two weeks, and four weeks after the intervention (Chuang and Tsao, 2013). Simple text messaging was an effective on-the-job training process for healthcare learners for their continuing education without disrupting their patient care work routine (Diedhiou et al., 2015; Alipour, Jannat and Hosseini, 2014). Most studies attributed the positive effect to spaced education principle and feasibility of mobile learning process to support the pedagogy (Chuang and Tsao, 2013; Diedhiou et al., 2015).  </w:t>
-      </w:r>
+        <w:rPr>
+          <w:b/>
+          <w:bCs/>
+          <w:i/>
+          <w:iCs/>
+          <w:lang w:val="en-IN"/>
+        </w:rPr>
+      </w:pPr>
+      <w:r>
+        <w:rPr>
+          <w:b/>
+          <w:bCs/>
+          <w:i/>
+          <w:iCs/>
+          <w:lang w:val="en-IN"/>
+        </w:rPr>
+        <w:t>The 1-Bit Binarization Bottleneck</w:t>
+      </w:r>
+    </w:p>
+    <w:p>
+      <w:pPr>
+        <w:ind w:firstLine="0"/>
+        <w:rPr>
+          <w:b/>
+          <w:bCs/>
+          <w:lang w:val="en-IN"/>
+        </w:rPr>
+      </w:pPr>
+    </w:p>
+    <w:p>
+      <w:pPr>
+        <w:ind w:firstLine="0"/>
+        <w:rPr>
+          <w:lang w:val="en-IN"/>
+        </w:rPr>
+      </w:pPr>
+      <w:r>
+        <w:rPr>
+          <w:lang w:val="en-IN"/>
+        </w:rPr>
+        <w:t>Binary Neural Networks (BNNs) \cite{hubara2016</w:t>
+      </w:r>
+      <w:proofErr w:type="gramStart"/>
+      <w:r>
+        <w:rPr>
+          <w:lang w:val="en-IN"/>
+        </w:rPr>
+        <w:t>bnn,rastegari</w:t>
+      </w:r>
+      <w:proofErr w:type="gramEnd"/>
+      <w:r>
+        <w:rPr>
+          <w:lang w:val="en-IN"/>
+        </w:rPr>
+        <w:t>2016xnornet} constrain weights and activations to {−1, +1}, enabling XNOR-</w:t>
+      </w:r>
+      <w:proofErr w:type="spellStart"/>
+      <w:r>
+        <w:rPr>
+          <w:lang w:val="en-IN"/>
+        </w:rPr>
+        <w:t>popcount</w:t>
+      </w:r>
+      <w:proofErr w:type="spellEnd"/>
+      <w:r>
+        <w:rPr>
+          <w:lang w:val="en-IN"/>
+        </w:rPr>
+        <w:t xml:space="preserve"> computation. XNOR-Net introduced per-channel scaling factors (α = </w:t>
+      </w:r>
+      <w:proofErr w:type="spellStart"/>
+      <w:r>
+        <w:rPr>
+          <w:lang w:val="en-IN"/>
+        </w:rPr>
+        <w:t>mean|W</w:t>
+      </w:r>
+      <w:proofErr w:type="spellEnd"/>
+      <w:r>
+        <w:rPr>
+          <w:lang w:val="en-IN"/>
+        </w:rPr>
+        <w:t>|) to reduce quantization error. The Straight-Through Estimator (STE) \cite{bengio2013ste} approximates gradients through the non-differentiable sign function, allowing BNNs to be trained end-to-end. While BNNs have been successfully applied to discriminative tasks (image classification \cite{liu2020</w:t>
+      </w:r>
+      <w:proofErr w:type="gramStart"/>
+      <w:r>
+        <w:rPr>
+          <w:lang w:val="en-IN"/>
+        </w:rPr>
+        <w:t>reactnet,martinez</w:t>
+      </w:r>
+      <w:proofErr w:type="gramEnd"/>
+      <w:r>
+        <w:rPr>
+          <w:lang w:val="en-IN"/>
+        </w:rPr>
+        <w:t>2020training}), applying them to generative models - which must preserve the full geometry of the data distribution rather than project to a finite label space - has been largely unexplored.</w:t>
+      </w:r>
+    </w:p>
+    <w:p>
+      <w:pPr>
+        <w:ind w:firstLine="0"/>
+        <w:rPr>
+          <w:lang w:val="en-IN"/>
+        </w:rPr>
+      </w:pPr>
+    </w:p>
+    <w:p>
+      <w:pPr>
+        <w:ind w:firstLine="0"/>
+        <w:rPr>
+          <w:lang w:val="en-IN"/>
+        </w:rPr>
+      </w:pPr>
+      <w:proofErr w:type="spellStart"/>
+      <w:r>
+        <w:rPr>
+          <w:lang w:val="en-IN"/>
+        </w:rPr>
+        <w:t>BiDM</w:t>
+      </w:r>
+      <w:proofErr w:type="spellEnd"/>
+      <w:r>
+        <w:rPr>
+          <w:lang w:val="en-IN"/>
+        </w:rPr>
+        <w:t xml:space="preserve"> \cite{bidm2024} represents the first work to fully binarize a diffusion model (W1A1), achieving FID 22.74 on LSUN-Bedrooms 256×256 through a combination of Timestep-friendly Binary Structure (TBS), which uses learnable activation </w:t>
+      </w:r>
+      <w:proofErr w:type="spellStart"/>
+      <w:r>
+        <w:rPr>
+          <w:lang w:val="en-IN"/>
+        </w:rPr>
+        <w:t>binarizers</w:t>
+      </w:r>
+      <w:proofErr w:type="spellEnd"/>
+      <w:r>
+        <w:rPr>
+          <w:lang w:val="en-IN"/>
+        </w:rPr>
+        <w:t xml:space="preserve"> and cross-timestep connections to handle activation distribution shift, and Space Patched Distillation (SPD), which aligns binary features with a full-precision teacher through patch-level distillation. </w:t>
+      </w:r>
+      <w:proofErr w:type="spellStart"/>
+      <w:r>
+        <w:rPr>
+          <w:lang w:val="en-IN"/>
+        </w:rPr>
+        <w:t>BiDM</w:t>
+      </w:r>
+      <w:proofErr w:type="spellEnd"/>
+      <w:r>
+        <w:rPr>
+          <w:lang w:val="en-IN"/>
+        </w:rPr>
+        <w:t xml:space="preserve"> yields 28.0× storage reduction and 52.7× operations savings. Critically, </w:t>
+      </w:r>
+      <w:proofErr w:type="spellStart"/>
+      <w:r>
+        <w:rPr>
+          <w:lang w:val="en-IN"/>
+        </w:rPr>
+        <w:t>BiDM</w:t>
+      </w:r>
+      <w:proofErr w:type="spellEnd"/>
+      <w:r>
+        <w:rPr>
+          <w:lang w:val="en-IN"/>
+        </w:rPr>
+        <w:t xml:space="preserve"> requires a full-precision teacher trained and available for distillation - a dependency our work removes entirely.</w:t>
+      </w:r>
+    </w:p>
+    <w:p>
+      <w:pPr>
+        <w:ind w:firstLine="0"/>
+        <w:rPr>
+          <w:lang w:val="en-IN"/>
+        </w:rPr>
+      </w:pPr>
+    </w:p>
+    <w:p>
+      <w:pPr>
+        <w:ind w:firstLine="0"/>
+        <w:rPr>
+          <w:b/>
+          <w:bCs/>
+          <w:i/>
+          <w:iCs/>
+          <w:lang w:val="en-IN"/>
+        </w:rPr>
+      </w:pPr>
+      <w:r>
+        <w:rPr>
+          <w:b/>
+          <w:bCs/>
+          <w:i/>
+          <w:iCs/>
+          <w:lang w:val="en-IN"/>
+        </w:rPr>
+        <w:t>Pre-Activation Residual Networks</w:t>
+      </w:r>
+    </w:p>
+    <w:p>
+      <w:pPr>
+        <w:ind w:firstLine="0"/>
+        <w:rPr>
+          <w:lang w:val="en-IN"/>
+        </w:rPr>
+      </w:pPr>
+    </w:p>
+    <w:p>
+      <w:pPr>
+        <w:ind w:firstLine="0"/>
+        <w:rPr>
+          <w:lang w:val="en-IN"/>
+        </w:rPr>
+      </w:pPr>
+      <w:r>
+        <w:rPr>
+          <w:lang w:val="en-IN"/>
+        </w:rPr>
+        <w:t xml:space="preserve">He et al. \cite{he2016preact} showed that placing batch normalization and activation before the convolution (pre-activation ordering: BN → Act → Conv) improves gradient flow in deep residual networks by allowing gradients to pass through the skip connection without traversing a normalization layer. In the BNN context, pre-activation ordering has additional significance: </w:t>
+      </w:r>
+      <w:proofErr w:type="spellStart"/>
+      <w:r>
+        <w:rPr>
+          <w:lang w:val="en-IN"/>
+        </w:rPr>
+        <w:t>BatchNorm</w:t>
+      </w:r>
+      <w:proofErr w:type="spellEnd"/>
+      <w:r>
+        <w:rPr>
+          <w:lang w:val="en-IN"/>
+        </w:rPr>
+        <w:t xml:space="preserve"> normalizes the pre-activation distribution to near zero mean and unit variance, calibrating inputs to the sign function's decision boundary and improving STE effectiveness. We adopt this ordering throughout our binary architectures as a structural mechanism for sustaining topological stability during training.</w:t>
+      </w:r>
+    </w:p>
+    <w:p>
+      <w:pPr>
+        <w:ind w:firstLine="0"/>
+        <w:rPr>
+          <w:lang w:val="en-IN"/>
+        </w:rPr>
+      </w:pPr>
+    </w:p>
+    <w:p>
+      <w:pPr>
+        <w:ind w:firstLine="0"/>
+        <w:rPr>
+          <w:lang w:val="en-IN"/>
+        </w:rPr>
+      </w:pPr>
+    </w:p>
+    <w:p>
+      <w:pPr>
+        <w:ind w:firstLine="0"/>
+        <w:rPr>
+          <w:b/>
+          <w:bCs/>
+          <w:lang w:val="en-IN"/>
+        </w:rPr>
+      </w:pPr>
+    </w:p>
+    <w:p>
+      <w:pPr>
+        <w:rPr>
+          <w:lang w:val="en-IN"/>
+        </w:rPr>
+      </w:pPr>
+    </w:p>
+    <w:p>
+      <w:pPr>
+        <w:rPr>
+          <w:lang w:val="en-IN"/>
+        </w:rPr>
+      </w:pPr>
     </w:p>
     <w:p/>
     <w:p>
@@ -614,7 +2091,7 @@
                     <pic:cNvPicPr/>
                   </pic:nvPicPr>
                   <pic:blipFill rotWithShape="1">
-                    <a:blip r:embed="rId8"/>
+                    <a:blip r:embed="rId11"/>
                     <a:srcRect l="31410" t="12044" r="3846" b="5683"/>
                     <a:stretch/>
                   </pic:blipFill>
@@ -687,7 +2164,15 @@
         <w:ind w:firstLine="0"/>
       </w:pPr>
       <w:r>
-        <w:t xml:space="preserve">Visual modeling for performance just in time is another central instructional approach for effective mobile learning. This instructional strategy often involves reducing extraneous cognitive load on the spot, providing worked examples right before performing a critical task, and visualizing learning object in three dimensional presentations. </w:t>
+        <w:t xml:space="preserve">Visual modeling for performance just in time is another central instructional approach for effective mobile learning. This instructional strategy often involves reducing extraneous cognitive load on the spot, providing worked examples right before performing a critical task, and visualizing learning object in </w:t>
+      </w:r>
+      <w:proofErr w:type="gramStart"/>
+      <w:r>
+        <w:t>three dimensional</w:t>
+      </w:r>
+      <w:proofErr w:type="gramEnd"/>
+      <w:r>
+        <w:t xml:space="preserve"> presentations. </w:t>
       </w:r>
     </w:p>
     <w:p>
@@ -709,21 +2194,21 @@
         <w:pStyle w:val="quota"/>
       </w:pPr>
       <w:r>
-        <w:t xml:space="preserve">Findings in this study may not represent all possible instructional strategies exhaustively but provided some of the potentials of mobile learning processes. Simply adopting traditional e-learning approaches may not necessarily lead to positive mobile learning experiences as </w:t>
+        <w:t xml:space="preserve">Findings in this study may not represent all possible instructional strategies exhaustively but provided some of the potentials of mobile learning processes. Simply adopting traditional e-learning approaches may not necessarily lead to positive mobile learning experiences as mobile learning leans more toward informal, personal, context-oriented, instant, and opportunistic experiences rather than formal, structured, and media-rich traditional e-learning experiences (Traxler, 2007). More insightful, thoughtful, and innovative design approaches aligned with the mobile learning characteristics should be investigated and studied. </w:t>
+      </w:r>
+    </w:p>
+    <w:p>
+      <w:pPr>
+        <w:ind w:firstLine="0"/>
+      </w:pPr>
+    </w:p>
+    <w:p>
+      <w:r>
+        <w:t xml:space="preserve">Hawkes et al. (2013) investigated the effect of short visual instruction right before performing newborn intubation and found that this approach was effective for improving both knowledge and procedural skills for novice learners. Medical students performed better with patient encounters in an emergency department setting when they had immediate access to an </w:t>
       </w:r>
       <w:r>
         <w:lastRenderedPageBreak/>
-        <w:t xml:space="preserve">mobile learning leans more toward informal, personal, context-oriented, instant, and opportunistic experiences rather than formal, structured, and media-rich traditional e-learning experiences (Traxler, 2007). More insightful, thoughtful, and innovative design approaches aligned with the mobile learning characteristics should be investigated and studied. </w:t>
-      </w:r>
-    </w:p>
-    <w:p>
-      <w:pPr>
-        <w:ind w:firstLine="0"/>
-      </w:pPr>
-    </w:p>
-    <w:p>
-      <w:r>
-        <w:t xml:space="preserve">Hawkes et al. (2013) investigated the effect of short visual instruction right before performing newborn intubation and found that this approach was effective for improving both knowledge and procedural skills for novice learners. Medical students performed better with patient encounters in an emergency department setting when they had immediate access to an instructional video right before seeing a patient in the emergency room (Tews et al., 2011). A similar effect was found in another study. According to Noguera et al. (2013), when second year students in physical therapy had access to two- or three-dimensional images of anatomy on their mobile devices during a practice session, their knowledge gain was higher than those who did not have such learning environments. With resources on their mobile devices, the students were able to visualize specific anatomy of knee, ankle, and pelvic zone as they practiced physical therapy. This allowed the participants to deeply engage in learning how physical therapy works in relation to a specific anatomy structure. </w:t>
+        <w:t xml:space="preserve">instructional video right before seeing a patient in the emergency room (Tews et al., 2011). A similar effect was found in another study. According to Noguera et al. (2013), when second year students in physical therapy had access to two- or three-dimensional images of anatomy on their mobile devices during a practice session, their knowledge gain was higher than those who did not have such learning environments. With resources on their mobile devices, the students were able to visualize specific anatomy of knee, ankle, and pelvic zone as they practiced physical therapy. This allowed the participants to deeply engage in learning how physical therapy works in relation to a specific anatomy structure. </w:t>
       </w:r>
     </w:p>
     <w:p/>
@@ -1059,7 +2544,29 @@
                 <w:sz w:val="16"/>
                 <w:szCs w:val="16"/>
               </w:rPr>
-              <w:t>Physician Assistant(PA)/Nursing/Medic/Tech</w:t>
+              <w:t xml:space="preserve">Physician </w:t>
+            </w:r>
+            <w:proofErr w:type="gramStart"/>
+            <w:r>
+              <w:rPr>
+                <w:rFonts w:ascii="Times New Roman" w:hAnsi="Times New Roman" w:cs="Times New Roman"/>
+                <w:b w:val="0"/>
+                <w:bCs w:val="0"/>
+                <w:sz w:val="16"/>
+                <w:szCs w:val="16"/>
+              </w:rPr>
+              <w:t>Assistant(</w:t>
+            </w:r>
+            <w:proofErr w:type="gramEnd"/>
+            <w:r>
+              <w:rPr>
+                <w:rFonts w:ascii="Times New Roman" w:hAnsi="Times New Roman" w:cs="Times New Roman"/>
+                <w:b w:val="0"/>
+                <w:bCs w:val="0"/>
+                <w:sz w:val="16"/>
+                <w:szCs w:val="16"/>
+              </w:rPr>
+              <w:t>PA)/Nursing/Medic/Tech</w:t>
             </w:r>
           </w:p>
         </w:tc>
@@ -1305,11 +2812,7 @@
     </w:p>
     <w:p>
       <w:r>
-        <w:t xml:space="preserve">Mobile learning is a pedagogical process enriched by context-sensitivity of being (location) and doing (activity) of a learner or a teacher. It is a comprehensive process to create meaningful instructional and learning interactions in consideration of where learners and teachers will be and what they will be doing. Simple transferring decontextualized traditional curriculum </w:t>
-      </w:r>
-      <w:r>
-        <w:lastRenderedPageBreak/>
-        <w:t>activities via a mobile device can have limited effectiveness. The mobile leaning pedagogical question is not only about making instructions or guidance available for just-in-time learning, but also about creating an expert presence</w:t>
+        <w:t>Mobile learning is a pedagogical process enriched by context-sensitivity of being (location) and doing (activity) of a learner or a teacher. It is a comprehensive process to create meaningful instructional and learning interactions in consideration of where learners and teachers will be and what they will be doing. Simple transferring decontextualized traditional curriculum activities via a mobile device can have limited effectiveness. The mobile leaning pedagogical question is not only about making instructions or guidance available for just-in-time learning, but also about creating an expert presence</w:t>
       </w:r>
       <w:r>
         <w:t xml:space="preserve"> for a specific individual</w:t>
@@ -1338,6 +2841,7 @@
         <w:ind w:firstLine="0"/>
       </w:pPr>
       <w:r>
+        <w:lastRenderedPageBreak/>
         <w:t>None</w:t>
       </w:r>
     </w:p>
@@ -1347,9 +2851,11 @@
       <w:pPr>
         <w:pStyle w:val="Heading2"/>
       </w:pPr>
+      <w:proofErr w:type="spellStart"/>
       <w:r>
         <w:t>References</w:t>
       </w:r>
+      <w:proofErr w:type="spellEnd"/>
     </w:p>
     <w:p>
       <w:pPr>
@@ -1626,13 +3132,10 @@
       </w:pPr>
     </w:p>
     <w:sectPr>
-      <w:headerReference w:type="even" r:id="rId9"/>
-      <w:headerReference w:type="default" r:id="rId10"/>
-      <w:headerReference w:type="first" r:id="rId11"/>
       <w:footnotePr>
         <w:numRestart w:val="eachSect"/>
       </w:footnotePr>
-      <w:type w:val="oddPage"/>
+      <w:type w:val="continuous"/>
       <w:pgSz w:w="12240" w:h="15840" w:code="1"/>
       <w:pgMar w:top="1620" w:right="2160" w:bottom="1980" w:left="2160" w:header="1044" w:footer="1404" w:gutter="0"/>
       <w:cols w:space="720"/>
@@ -1643,7 +3146,7 @@
 </file>
 
 <file path=word/endnotes.xml><?xml version="1.0" encoding="utf-8"?>
-<w:endnotes xmlns:wpc="http://schemas.microsoft.com/office/word/2010/wordprocessingCanvas" xmlns:cx="http://schemas.microsoft.com/office/drawing/2014/chartex" xmlns:cx1="http://schemas.microsoft.com/office/drawing/2015/9/8/chartex" xmlns:mc="http://schemas.openxmlformats.org/markup-compatibility/2006" xmlns:o="urn:schemas-microsoft-com:office:office" xmlns:r="http://schemas.openxmlformats.org/officeDocument/2006/relationships" xmlns:m="http://schemas.openxmlformats.org/officeDocument/2006/math" xmlns:v="urn:schemas-microsoft-com:vml" xmlns:wp14="http://schemas.microsoft.com/office/word/2010/wordprocessingDrawing" xmlns:wp="http://schemas.openxmlformats.org/drawingml/2006/wordprocessingDrawing" xmlns:w10="urn:schemas-microsoft-com:office:word" xmlns:w="http://schemas.openxmlformats.org/wordprocessingml/2006/main" xmlns:w14="http://schemas.microsoft.com/office/word/2010/wordml" xmlns:w15="http://schemas.microsoft.com/office/word/2012/wordml" xmlns:w16se="http://schemas.microsoft.com/office/word/2015/wordml/symex" xmlns:wpg="http://schemas.microsoft.com/office/word/2010/wordprocessingGroup" xmlns:wpi="http://schemas.microsoft.com/office/word/2010/wordprocessingInk" xmlns:wne="http://schemas.microsoft.com/office/word/2006/wordml" xmlns:wps="http://schemas.microsoft.com/office/word/2010/wordprocessingShape" mc:Ignorable="w14 w15 w16se wp14">
+<w:endnotes xmlns:wpc="http://schemas.microsoft.com/office/word/2010/wordprocessingCanvas" xmlns:cx="http://schemas.microsoft.com/office/drawing/2014/chartex" xmlns:cx1="http://schemas.microsoft.com/office/drawing/2015/9/8/chartex" xmlns:cx2="http://schemas.microsoft.com/office/drawing/2015/10/21/chartex" xmlns:cx3="http://schemas.microsoft.com/office/drawing/2016/5/9/chartex" xmlns:cx4="http://schemas.microsoft.com/office/drawing/2016/5/10/chartex" xmlns:cx5="http://schemas.microsoft.com/office/drawing/2016/5/11/chartex" xmlns:cx6="http://schemas.microsoft.com/office/drawing/2016/5/12/chartex" xmlns:cx7="http://schemas.microsoft.com/office/drawing/2016/5/13/chartex" xmlns:cx8="http://schemas.microsoft.com/office/drawing/2016/5/14/chartex" xmlns:mc="http://schemas.openxmlformats.org/markup-compatibility/2006" xmlns:aink="http://schemas.microsoft.com/office/drawing/2016/ink" xmlns:am3d="http://schemas.microsoft.com/office/drawing/2017/model3d" xmlns:o="urn:schemas-microsoft-com:office:office" xmlns:oel="http://schemas.microsoft.com/office/2019/extlst" xmlns:r="http://schemas.openxmlformats.org/officeDocument/2006/relationships" xmlns:m="http://schemas.openxmlformats.org/officeDocument/2006/math" xmlns:v="urn:schemas-microsoft-com:vml" xmlns:wp14="http://schemas.microsoft.com/office/word/2010/wordprocessingDrawing" xmlns:wp="http://schemas.openxmlformats.org/drawingml/2006/wordprocessingDrawing" xmlns:w10="urn:schemas-microsoft-com:office:word" xmlns:w="http://schemas.openxmlformats.org/wordprocessingml/2006/main" xmlns:w14="http://schemas.microsoft.com/office/word/2010/wordml" xmlns:w15="http://schemas.microsoft.com/office/word/2012/wordml" xmlns:w16cex="http://schemas.microsoft.com/office/word/2018/wordml/cex" xmlns:w16cid="http://schemas.microsoft.com/office/word/2016/wordml/cid" xmlns:w16="http://schemas.microsoft.com/office/word/2018/wordml" xmlns:w16du="http://schemas.microsoft.com/office/word/2023/wordml/word16du" xmlns:w16sdtdh="http://schemas.microsoft.com/office/word/2020/wordml/sdtdatahash" xmlns:w16sdtfl="http://schemas.microsoft.com/office/word/2024/wordml/sdtformatlock" xmlns:w16se="http://schemas.microsoft.com/office/word/2015/wordml/symex" xmlns:wpg="http://schemas.microsoft.com/office/word/2010/wordprocessingGroup" xmlns:wpi="http://schemas.microsoft.com/office/word/2010/wordprocessingInk" xmlns:wne="http://schemas.microsoft.com/office/word/2006/wordml" xmlns:wps="http://schemas.microsoft.com/office/word/2010/wordprocessingShape" mc:Ignorable="w14 w15 w16se w16cid w16 w16cex w16sdtdh w16sdtfl w16du wp14">
   <w:endnote w:type="separator" w:id="-1">
     <w:p>
       <w:pPr>
@@ -1678,7 +3181,7 @@
 </file>
 
 <file path=word/footnotes.xml><?xml version="1.0" encoding="utf-8"?>
-<w:footnotes xmlns:wpc="http://schemas.microsoft.com/office/word/2010/wordprocessingCanvas" xmlns:cx="http://schemas.microsoft.com/office/drawing/2014/chartex" xmlns:cx1="http://schemas.microsoft.com/office/drawing/2015/9/8/chartex" xmlns:mc="http://schemas.openxmlformats.org/markup-compatibility/2006" xmlns:o="urn:schemas-microsoft-com:office:office" xmlns:r="http://schemas.openxmlformats.org/officeDocument/2006/relationships" xmlns:m="http://schemas.openxmlformats.org/officeDocument/2006/math" xmlns:v="urn:schemas-microsoft-com:vml" xmlns:wp14="http://schemas.microsoft.com/office/word/2010/wordprocessingDrawing" xmlns:wp="http://schemas.openxmlformats.org/drawingml/2006/wordprocessingDrawing" xmlns:w10="urn:schemas-microsoft-com:office:word" xmlns:w="http://schemas.openxmlformats.org/wordprocessingml/2006/main" xmlns:w14="http://schemas.microsoft.com/office/word/2010/wordml" xmlns:w15="http://schemas.microsoft.com/office/word/2012/wordml" xmlns:w16se="http://schemas.microsoft.com/office/word/2015/wordml/symex" xmlns:wpg="http://schemas.microsoft.com/office/word/2010/wordprocessingGroup" xmlns:wpi="http://schemas.microsoft.com/office/word/2010/wordprocessingInk" xmlns:wne="http://schemas.microsoft.com/office/word/2006/wordml" xmlns:wps="http://schemas.microsoft.com/office/word/2010/wordprocessingShape" mc:Ignorable="w14 w15 w16se wp14">
+<w:footnotes xmlns:wpc="http://schemas.microsoft.com/office/word/2010/wordprocessingCanvas" xmlns:cx="http://schemas.microsoft.com/office/drawing/2014/chartex" xmlns:cx1="http://schemas.microsoft.com/office/drawing/2015/9/8/chartex" xmlns:cx2="http://schemas.microsoft.com/office/drawing/2015/10/21/chartex" xmlns:cx3="http://schemas.microsoft.com/office/drawing/2016/5/9/chartex" xmlns:cx4="http://schemas.microsoft.com/office/drawing/2016/5/10/chartex" xmlns:cx5="http://schemas.microsoft.com/office/drawing/2016/5/11/chartex" xmlns:cx6="http://schemas.microsoft.com/office/drawing/2016/5/12/chartex" xmlns:cx7="http://schemas.microsoft.com/office/drawing/2016/5/13/chartex" xmlns:cx8="http://schemas.microsoft.com/office/drawing/2016/5/14/chartex" xmlns:mc="http://schemas.openxmlformats.org/markup-compatibility/2006" xmlns:aink="http://schemas.microsoft.com/office/drawing/2016/ink" xmlns:am3d="http://schemas.microsoft.com/office/drawing/2017/model3d" xmlns:o="urn:schemas-microsoft-com:office:office" xmlns:oel="http://schemas.microsoft.com/office/2019/extlst" xmlns:r="http://schemas.openxmlformats.org/officeDocument/2006/relationships" xmlns:m="http://schemas.openxmlformats.org/officeDocument/2006/math" xmlns:v="urn:schemas-microsoft-com:vml" xmlns:wp14="http://schemas.microsoft.com/office/word/2010/wordprocessingDrawing" xmlns:wp="http://schemas.openxmlformats.org/drawingml/2006/wordprocessingDrawing" xmlns:w10="urn:schemas-microsoft-com:office:word" xmlns:w="http://schemas.openxmlformats.org/wordprocessingml/2006/main" xmlns:w14="http://schemas.microsoft.com/office/word/2010/wordml" xmlns:w15="http://schemas.microsoft.com/office/word/2012/wordml" xmlns:w16cex="http://schemas.microsoft.com/office/word/2018/wordml/cex" xmlns:w16cid="http://schemas.microsoft.com/office/word/2016/wordml/cid" xmlns:w16="http://schemas.microsoft.com/office/word/2018/wordml" xmlns:w16du="http://schemas.microsoft.com/office/word/2023/wordml/word16du" xmlns:w16sdtdh="http://schemas.microsoft.com/office/word/2020/wordml/sdtdatahash" xmlns:w16sdtfl="http://schemas.microsoft.com/office/word/2024/wordml/sdtformatlock" xmlns:w16se="http://schemas.microsoft.com/office/word/2015/wordml/symex" xmlns:wpg="http://schemas.microsoft.com/office/word/2010/wordprocessingGroup" xmlns:wpi="http://schemas.microsoft.com/office/word/2010/wordprocessingInk" xmlns:wne="http://schemas.microsoft.com/office/word/2006/wordml" xmlns:wps="http://schemas.microsoft.com/office/word/2010/wordprocessingShape" mc:Ignorable="w14 w15 w16se w16cid w16 w16cex w16sdtdh w16sdtfl w16du wp14">
   <w:footnote w:type="separator" w:id="-1">
     <w:p>
       <w:pPr>
@@ -1714,7 +3217,7 @@
 </file>
 
 <file path=word/header1.xml><?xml version="1.0" encoding="utf-8"?>
-<w:hdr xmlns:wpc="http://schemas.microsoft.com/office/word/2010/wordprocessingCanvas" xmlns:cx="http://schemas.microsoft.com/office/drawing/2014/chartex" xmlns:cx1="http://schemas.microsoft.com/office/drawing/2015/9/8/chartex" xmlns:mc="http://schemas.openxmlformats.org/markup-compatibility/2006" xmlns:o="urn:schemas-microsoft-com:office:office" xmlns:r="http://schemas.openxmlformats.org/officeDocument/2006/relationships" xmlns:m="http://schemas.openxmlformats.org/officeDocument/2006/math" xmlns:v="urn:schemas-microsoft-com:vml" xmlns:wp14="http://schemas.microsoft.com/office/word/2010/wordprocessingDrawing" xmlns:wp="http://schemas.openxmlformats.org/drawingml/2006/wordprocessingDrawing" xmlns:w10="urn:schemas-microsoft-com:office:word" xmlns:w="http://schemas.openxmlformats.org/wordprocessingml/2006/main" xmlns:w14="http://schemas.microsoft.com/office/word/2010/wordml" xmlns:w15="http://schemas.microsoft.com/office/word/2012/wordml" xmlns:w16se="http://schemas.microsoft.com/office/word/2015/wordml/symex" xmlns:wpg="http://schemas.microsoft.com/office/word/2010/wordprocessingGroup" xmlns:wpi="http://schemas.microsoft.com/office/word/2010/wordprocessingInk" xmlns:wne="http://schemas.microsoft.com/office/word/2006/wordml" xmlns:wps="http://schemas.microsoft.com/office/word/2010/wordprocessingShape" mc:Ignorable="w14 w15 w16se wp14">
+<w:hdr xmlns:wpc="http://schemas.microsoft.com/office/word/2010/wordprocessingCanvas" xmlns:cx="http://schemas.microsoft.com/office/drawing/2014/chartex" xmlns:cx1="http://schemas.microsoft.com/office/drawing/2015/9/8/chartex" xmlns:cx2="http://schemas.microsoft.com/office/drawing/2015/10/21/chartex" xmlns:cx3="http://schemas.microsoft.com/office/drawing/2016/5/9/chartex" xmlns:cx4="http://schemas.microsoft.com/office/drawing/2016/5/10/chartex" xmlns:cx5="http://schemas.microsoft.com/office/drawing/2016/5/11/chartex" xmlns:cx6="http://schemas.microsoft.com/office/drawing/2016/5/12/chartex" xmlns:cx7="http://schemas.microsoft.com/office/drawing/2016/5/13/chartex" xmlns:cx8="http://schemas.microsoft.com/office/drawing/2016/5/14/chartex" xmlns:mc="http://schemas.openxmlformats.org/markup-compatibility/2006" xmlns:aink="http://schemas.microsoft.com/office/drawing/2016/ink" xmlns:am3d="http://schemas.microsoft.com/office/drawing/2017/model3d" xmlns:o="urn:schemas-microsoft-com:office:office" xmlns:oel="http://schemas.microsoft.com/office/2019/extlst" xmlns:r="http://schemas.openxmlformats.org/officeDocument/2006/relationships" xmlns:m="http://schemas.openxmlformats.org/officeDocument/2006/math" xmlns:v="urn:schemas-microsoft-com:vml" xmlns:wp14="http://schemas.microsoft.com/office/word/2010/wordprocessingDrawing" xmlns:wp="http://schemas.openxmlformats.org/drawingml/2006/wordprocessingDrawing" xmlns:w10="urn:schemas-microsoft-com:office:word" xmlns:w="http://schemas.openxmlformats.org/wordprocessingml/2006/main" xmlns:w14="http://schemas.microsoft.com/office/word/2010/wordml" xmlns:w15="http://schemas.microsoft.com/office/word/2012/wordml" xmlns:w16cex="http://schemas.microsoft.com/office/word/2018/wordml/cex" xmlns:w16cid="http://schemas.microsoft.com/office/word/2016/wordml/cid" xmlns:w16="http://schemas.microsoft.com/office/word/2018/wordml" xmlns:w16du="http://schemas.microsoft.com/office/word/2023/wordml/word16du" xmlns:w16sdtdh="http://schemas.microsoft.com/office/word/2020/wordml/sdtdatahash" xmlns:w16sdtfl="http://schemas.microsoft.com/office/word/2024/wordml/sdtformatlock" xmlns:w16se="http://schemas.microsoft.com/office/word/2015/wordml/symex" xmlns:wpg="http://schemas.microsoft.com/office/word/2010/wordprocessingGroup" xmlns:wpi="http://schemas.microsoft.com/office/word/2010/wordprocessingInk" xmlns:wne="http://schemas.microsoft.com/office/word/2006/wordml" xmlns:wps="http://schemas.microsoft.com/office/word/2010/wordprocessingShape" mc:Ignorable="w14 w15 w16se w16cid w16 w16cex w16sdtdh w16sdtfl w16du wp14">
   <w:p>
     <w:pPr>
       <w:pStyle w:val="Header"/>
@@ -1765,9 +3268,19 @@
         <w:bottom w:val="none" w:sz="0" w:space="0" w:color="auto"/>
       </w:pBdr>
     </w:pPr>
+    <w:proofErr w:type="spellStart"/>
     <w:r>
-      <w:t>Heeyoung Han, Larry Hurtubise, Geraud Plantegenest</w:t>
+      <w:t>Heeyoung</w:t>
     </w:r>
+    <w:proofErr w:type="spellEnd"/>
+    <w:r>
+      <w:t xml:space="preserve"> Han, Larry Hurtubise, Geraud </w:t>
+    </w:r>
+    <w:proofErr w:type="spellStart"/>
+    <w:r>
+      <w:t>Plantegenest</w:t>
+    </w:r>
+    <w:proofErr w:type="spellEnd"/>
     <w:r>
       <w:t xml:space="preserve"> et al.</w:t>
     </w:r>
@@ -1776,7 +3289,7 @@
 </file>
 
 <file path=word/header2.xml><?xml version="1.0" encoding="utf-8"?>
-<w:hdr xmlns:wpc="http://schemas.microsoft.com/office/word/2010/wordprocessingCanvas" xmlns:cx="http://schemas.microsoft.com/office/drawing/2014/chartex" xmlns:cx1="http://schemas.microsoft.com/office/drawing/2015/9/8/chartex" xmlns:mc="http://schemas.openxmlformats.org/markup-compatibility/2006" xmlns:o="urn:schemas-microsoft-com:office:office" xmlns:r="http://schemas.openxmlformats.org/officeDocument/2006/relationships" xmlns:m="http://schemas.openxmlformats.org/officeDocument/2006/math" xmlns:v="urn:schemas-microsoft-com:vml" xmlns:wp14="http://schemas.microsoft.com/office/word/2010/wordprocessingDrawing" xmlns:wp="http://schemas.openxmlformats.org/drawingml/2006/wordprocessingDrawing" xmlns:w10="urn:schemas-microsoft-com:office:word" xmlns:w="http://schemas.openxmlformats.org/wordprocessingml/2006/main" xmlns:w14="http://schemas.microsoft.com/office/word/2010/wordml" xmlns:w15="http://schemas.microsoft.com/office/word/2012/wordml" xmlns:w16se="http://schemas.microsoft.com/office/word/2015/wordml/symex" xmlns:wpg="http://schemas.microsoft.com/office/word/2010/wordprocessingGroup" xmlns:wpi="http://schemas.microsoft.com/office/word/2010/wordprocessingInk" xmlns:wne="http://schemas.microsoft.com/office/word/2006/wordml" xmlns:wps="http://schemas.microsoft.com/office/word/2010/wordprocessingShape" mc:Ignorable="w14 w15 w16se wp14">
+<w:hdr xmlns:wpc="http://schemas.microsoft.com/office/word/2010/wordprocessingCanvas" xmlns:cx="http://schemas.microsoft.com/office/drawing/2014/chartex" xmlns:cx1="http://schemas.microsoft.com/office/drawing/2015/9/8/chartex" xmlns:cx2="http://schemas.microsoft.com/office/drawing/2015/10/21/chartex" xmlns:cx3="http://schemas.microsoft.com/office/drawing/2016/5/9/chartex" xmlns:cx4="http://schemas.microsoft.com/office/drawing/2016/5/10/chartex" xmlns:cx5="http://schemas.microsoft.com/office/drawing/2016/5/11/chartex" xmlns:cx6="http://schemas.microsoft.com/office/drawing/2016/5/12/chartex" xmlns:cx7="http://schemas.microsoft.com/office/drawing/2016/5/13/chartex" xmlns:cx8="http://schemas.microsoft.com/office/drawing/2016/5/14/chartex" xmlns:mc="http://schemas.openxmlformats.org/markup-compatibility/2006" xmlns:aink="http://schemas.microsoft.com/office/drawing/2016/ink" xmlns:am3d="http://schemas.microsoft.com/office/drawing/2017/model3d" xmlns:o="urn:schemas-microsoft-com:office:office" xmlns:oel="http://schemas.microsoft.com/office/2019/extlst" xmlns:r="http://schemas.openxmlformats.org/officeDocument/2006/relationships" xmlns:m="http://schemas.openxmlformats.org/officeDocument/2006/math" xmlns:v="urn:schemas-microsoft-com:vml" xmlns:wp14="http://schemas.microsoft.com/office/word/2010/wordprocessingDrawing" xmlns:wp="http://schemas.openxmlformats.org/drawingml/2006/wordprocessingDrawing" xmlns:w10="urn:schemas-microsoft-com:office:word" xmlns:w="http://schemas.openxmlformats.org/wordprocessingml/2006/main" xmlns:w14="http://schemas.microsoft.com/office/word/2010/wordml" xmlns:w15="http://schemas.microsoft.com/office/word/2012/wordml" xmlns:w16cex="http://schemas.microsoft.com/office/word/2018/wordml/cex" xmlns:w16cid="http://schemas.microsoft.com/office/word/2016/wordml/cid" xmlns:w16="http://schemas.microsoft.com/office/word/2018/wordml" xmlns:w16du="http://schemas.microsoft.com/office/word/2023/wordml/word16du" xmlns:w16sdtdh="http://schemas.microsoft.com/office/word/2020/wordml/sdtdatahash" xmlns:w16sdtfl="http://schemas.microsoft.com/office/word/2024/wordml/sdtformatlock" xmlns:w16se="http://schemas.microsoft.com/office/word/2015/wordml/symex" xmlns:wpg="http://schemas.microsoft.com/office/word/2010/wordprocessingGroup" xmlns:wpi="http://schemas.microsoft.com/office/word/2010/wordprocessingInk" xmlns:wne="http://schemas.microsoft.com/office/word/2006/wordml" xmlns:wps="http://schemas.microsoft.com/office/word/2010/wordprocessingShape" mc:Ignorable="w14 w15 w16se w16cid w16 w16cex w16sdtdh w16sdtfl w16du wp14">
   <w:p>
     <w:pPr>
       <w:pStyle w:val="Header"/>
@@ -1835,7 +3348,7 @@
 </file>
 
 <file path=word/header3.xml><?xml version="1.0" encoding="utf-8"?>
-<w:hdr xmlns:wpc="http://schemas.microsoft.com/office/word/2010/wordprocessingCanvas" xmlns:cx="http://schemas.microsoft.com/office/drawing/2014/chartex" xmlns:cx1="http://schemas.microsoft.com/office/drawing/2015/9/8/chartex" xmlns:mc="http://schemas.openxmlformats.org/markup-compatibility/2006" xmlns:o="urn:schemas-microsoft-com:office:office" xmlns:r="http://schemas.openxmlformats.org/officeDocument/2006/relationships" xmlns:m="http://schemas.openxmlformats.org/officeDocument/2006/math" xmlns:v="urn:schemas-microsoft-com:vml" xmlns:wp14="http://schemas.microsoft.com/office/word/2010/wordprocessingDrawing" xmlns:wp="http://schemas.openxmlformats.org/drawingml/2006/wordprocessingDrawing" xmlns:w10="urn:schemas-microsoft-com:office:word" xmlns:w="http://schemas.openxmlformats.org/wordprocessingml/2006/main" xmlns:w14="http://schemas.microsoft.com/office/word/2010/wordml" xmlns:w15="http://schemas.microsoft.com/office/word/2012/wordml" xmlns:w16se="http://schemas.microsoft.com/office/word/2015/wordml/symex" xmlns:wpg="http://schemas.microsoft.com/office/word/2010/wordprocessingGroup" xmlns:wpi="http://schemas.microsoft.com/office/word/2010/wordprocessingInk" xmlns:wne="http://schemas.microsoft.com/office/word/2006/wordml" xmlns:wps="http://schemas.microsoft.com/office/word/2010/wordprocessingShape" mc:Ignorable="w14 w15 w16se wp14">
+<w:hdr xmlns:wpc="http://schemas.microsoft.com/office/word/2010/wordprocessingCanvas" xmlns:cx="http://schemas.microsoft.com/office/drawing/2014/chartex" xmlns:cx1="http://schemas.microsoft.com/office/drawing/2015/9/8/chartex" xmlns:cx2="http://schemas.microsoft.com/office/drawing/2015/10/21/chartex" xmlns:cx3="http://schemas.microsoft.com/office/drawing/2016/5/9/chartex" xmlns:cx4="http://schemas.microsoft.com/office/drawing/2016/5/10/chartex" xmlns:cx5="http://schemas.microsoft.com/office/drawing/2016/5/11/chartex" xmlns:cx6="http://schemas.microsoft.com/office/drawing/2016/5/12/chartex" xmlns:cx7="http://schemas.microsoft.com/office/drawing/2016/5/13/chartex" xmlns:cx8="http://schemas.microsoft.com/office/drawing/2016/5/14/chartex" xmlns:mc="http://schemas.openxmlformats.org/markup-compatibility/2006" xmlns:aink="http://schemas.microsoft.com/office/drawing/2016/ink" xmlns:am3d="http://schemas.microsoft.com/office/drawing/2017/model3d" xmlns:o="urn:schemas-microsoft-com:office:office" xmlns:oel="http://schemas.microsoft.com/office/2019/extlst" xmlns:r="http://schemas.openxmlformats.org/officeDocument/2006/relationships" xmlns:m="http://schemas.openxmlformats.org/officeDocument/2006/math" xmlns:v="urn:schemas-microsoft-com:vml" xmlns:wp14="http://schemas.microsoft.com/office/word/2010/wordprocessingDrawing" xmlns:wp="http://schemas.openxmlformats.org/drawingml/2006/wordprocessingDrawing" xmlns:w10="urn:schemas-microsoft-com:office:word" xmlns:w="http://schemas.openxmlformats.org/wordprocessingml/2006/main" xmlns:w14="http://schemas.microsoft.com/office/word/2010/wordml" xmlns:w15="http://schemas.microsoft.com/office/word/2012/wordml" xmlns:w16cex="http://schemas.microsoft.com/office/word/2018/wordml/cex" xmlns:w16cid="http://schemas.microsoft.com/office/word/2016/wordml/cid" xmlns:w16="http://schemas.microsoft.com/office/word/2018/wordml" xmlns:w16du="http://schemas.microsoft.com/office/word/2023/wordml/word16du" xmlns:w16sdtdh="http://schemas.microsoft.com/office/word/2020/wordml/sdtdatahash" xmlns:w16sdtfl="http://schemas.microsoft.com/office/word/2024/wordml/sdtformatlock" xmlns:w16se="http://schemas.microsoft.com/office/word/2015/wordml/symex" xmlns:wpg="http://schemas.microsoft.com/office/word/2010/wordprocessingGroup" xmlns:wpi="http://schemas.microsoft.com/office/word/2010/wordprocessingInk" xmlns:wne="http://schemas.microsoft.com/office/word/2006/wordml" xmlns:wps="http://schemas.microsoft.com/office/word/2010/wordprocessingShape" mc:Ignorable="w14 w15 w16se w16cid w16 w16cex w16sdtdh w16sdtfl w16du wp14">
   <w:p>
     <w:pPr>
       <w:pStyle w:val="Header"/>
@@ -1848,7 +3361,7 @@
 </file>
 
 <file path=word/numbering.xml><?xml version="1.0" encoding="utf-8"?>
-<w:numbering xmlns:wpc="http://schemas.microsoft.com/office/word/2010/wordprocessingCanvas" xmlns:cx="http://schemas.microsoft.com/office/drawing/2014/chartex" xmlns:cx1="http://schemas.microsoft.com/office/drawing/2015/9/8/chartex" xmlns:mc="http://schemas.openxmlformats.org/markup-compatibility/2006" xmlns:o="urn:schemas-microsoft-com:office:office" xmlns:r="http://schemas.openxmlformats.org/officeDocument/2006/relationships" xmlns:m="http://schemas.openxmlformats.org/officeDocument/2006/math" xmlns:v="urn:schemas-microsoft-com:vml" xmlns:wp14="http://schemas.microsoft.com/office/word/2010/wordprocessingDrawing" xmlns:wp="http://schemas.openxmlformats.org/drawingml/2006/wordprocessingDrawing" xmlns:w10="urn:schemas-microsoft-com:office:word" xmlns:w="http://schemas.openxmlformats.org/wordprocessingml/2006/main" xmlns:w14="http://schemas.microsoft.com/office/word/2010/wordml" xmlns:w15="http://schemas.microsoft.com/office/word/2012/wordml" xmlns:w16se="http://schemas.microsoft.com/office/word/2015/wordml/symex" xmlns:wpg="http://schemas.microsoft.com/office/word/2010/wordprocessingGroup" xmlns:wpi="http://schemas.microsoft.com/office/word/2010/wordprocessingInk" xmlns:wne="http://schemas.microsoft.com/office/word/2006/wordml" xmlns:wps="http://schemas.microsoft.com/office/word/2010/wordprocessingShape" mc:Ignorable="w14 w15 w16se wp14">
+<w:numbering xmlns:wpc="http://schemas.microsoft.com/office/word/2010/wordprocessingCanvas" xmlns:cx="http://schemas.microsoft.com/office/drawing/2014/chartex" xmlns:cx1="http://schemas.microsoft.com/office/drawing/2015/9/8/chartex" xmlns:cx2="http://schemas.microsoft.com/office/drawing/2015/10/21/chartex" xmlns:cx3="http://schemas.microsoft.com/office/drawing/2016/5/9/chartex" xmlns:cx4="http://schemas.microsoft.com/office/drawing/2016/5/10/chartex" xmlns:cx5="http://schemas.microsoft.com/office/drawing/2016/5/11/chartex" xmlns:cx6="http://schemas.microsoft.com/office/drawing/2016/5/12/chartex" xmlns:cx7="http://schemas.microsoft.com/office/drawing/2016/5/13/chartex" xmlns:cx8="http://schemas.microsoft.com/office/drawing/2016/5/14/chartex" xmlns:mc="http://schemas.openxmlformats.org/markup-compatibility/2006" xmlns:aink="http://schemas.microsoft.com/office/drawing/2016/ink" xmlns:am3d="http://schemas.microsoft.com/office/drawing/2017/model3d" xmlns:o="urn:schemas-microsoft-com:office:office" xmlns:oel="http://schemas.microsoft.com/office/2019/extlst" xmlns:r="http://schemas.openxmlformats.org/officeDocument/2006/relationships" xmlns:m="http://schemas.openxmlformats.org/officeDocument/2006/math" xmlns:v="urn:schemas-microsoft-com:vml" xmlns:wp14="http://schemas.microsoft.com/office/word/2010/wordprocessingDrawing" xmlns:wp="http://schemas.openxmlformats.org/drawingml/2006/wordprocessingDrawing" xmlns:w10="urn:schemas-microsoft-com:office:word" xmlns:w="http://schemas.openxmlformats.org/wordprocessingml/2006/main" xmlns:w14="http://schemas.microsoft.com/office/word/2010/wordml" xmlns:w15="http://schemas.microsoft.com/office/word/2012/wordml" xmlns:w16cex="http://schemas.microsoft.com/office/word/2018/wordml/cex" xmlns:w16cid="http://schemas.microsoft.com/office/word/2016/wordml/cid" xmlns:w16="http://schemas.microsoft.com/office/word/2018/wordml" xmlns:w16du="http://schemas.microsoft.com/office/word/2023/wordml/word16du" xmlns:w16sdtdh="http://schemas.microsoft.com/office/word/2020/wordml/sdtdatahash" xmlns:w16sdtfl="http://schemas.microsoft.com/office/word/2024/wordml/sdtformatlock" xmlns:w16se="http://schemas.microsoft.com/office/word/2015/wordml/symex" xmlns:wpg="http://schemas.microsoft.com/office/word/2010/wordprocessingGroup" xmlns:wpi="http://schemas.microsoft.com/office/word/2010/wordprocessingInk" xmlns:wne="http://schemas.microsoft.com/office/word/2006/wordml" xmlns:wps="http://schemas.microsoft.com/office/word/2010/wordprocessingShape" mc:Ignorable="w14 w15 w16se w16cid w16 w16cex w16sdtdh w16sdtfl w16du wp14">
   <w:abstractNum w:abstractNumId="0" w15:restartNumberingAfterBreak="0">
     <w:nsid w:val="FFFFFF7C"/>
     <w:multiLevelType w:val="singleLevel"/>
@@ -2034,41 +3547,157 @@
       </w:rPr>
     </w:lvl>
   </w:abstractNum>
-  <w:num w:numId="1">
+  <w:abstractNum w:abstractNumId="10" w15:restartNumberingAfterBreak="0">
+    <w:nsid w:val="2FCB3FD2"/>
+    <w:multiLevelType w:val="hybridMultilevel"/>
+    <w:tmpl w:val="2D8CDBAC"/>
+    <w:lvl w:ilvl="0" w:tplc="40090001">
+      <w:start w:val="1"/>
+      <w:numFmt w:val="bullet"/>
+      <w:lvlText w:val=""/>
+      <w:lvlJc w:val="left"/>
+      <w:pPr>
+        <w:ind w:left="720" w:hanging="360"/>
+      </w:pPr>
+      <w:rPr>
+        <w:rFonts w:ascii="Symbol" w:hAnsi="Symbol" w:hint="default"/>
+      </w:rPr>
+    </w:lvl>
+    <w:lvl w:ilvl="1" w:tplc="40090003" w:tentative="1">
+      <w:start w:val="1"/>
+      <w:numFmt w:val="bullet"/>
+      <w:lvlText w:val="o"/>
+      <w:lvlJc w:val="left"/>
+      <w:pPr>
+        <w:ind w:left="1440" w:hanging="360"/>
+      </w:pPr>
+      <w:rPr>
+        <w:rFonts w:ascii="Courier New" w:hAnsi="Courier New" w:cs="Courier New" w:hint="default"/>
+      </w:rPr>
+    </w:lvl>
+    <w:lvl w:ilvl="2" w:tplc="40090005" w:tentative="1">
+      <w:start w:val="1"/>
+      <w:numFmt w:val="bullet"/>
+      <w:lvlText w:val=""/>
+      <w:lvlJc w:val="left"/>
+      <w:pPr>
+        <w:ind w:left="2160" w:hanging="360"/>
+      </w:pPr>
+      <w:rPr>
+        <w:rFonts w:ascii="Wingdings" w:hAnsi="Wingdings" w:hint="default"/>
+      </w:rPr>
+    </w:lvl>
+    <w:lvl w:ilvl="3" w:tplc="40090001" w:tentative="1">
+      <w:start w:val="1"/>
+      <w:numFmt w:val="bullet"/>
+      <w:lvlText w:val=""/>
+      <w:lvlJc w:val="left"/>
+      <w:pPr>
+        <w:ind w:left="2880" w:hanging="360"/>
+      </w:pPr>
+      <w:rPr>
+        <w:rFonts w:ascii="Symbol" w:hAnsi="Symbol" w:hint="default"/>
+      </w:rPr>
+    </w:lvl>
+    <w:lvl w:ilvl="4" w:tplc="40090003" w:tentative="1">
+      <w:start w:val="1"/>
+      <w:numFmt w:val="bullet"/>
+      <w:lvlText w:val="o"/>
+      <w:lvlJc w:val="left"/>
+      <w:pPr>
+        <w:ind w:left="3600" w:hanging="360"/>
+      </w:pPr>
+      <w:rPr>
+        <w:rFonts w:ascii="Courier New" w:hAnsi="Courier New" w:cs="Courier New" w:hint="default"/>
+      </w:rPr>
+    </w:lvl>
+    <w:lvl w:ilvl="5" w:tplc="40090005" w:tentative="1">
+      <w:start w:val="1"/>
+      <w:numFmt w:val="bullet"/>
+      <w:lvlText w:val=""/>
+      <w:lvlJc w:val="left"/>
+      <w:pPr>
+        <w:ind w:left="4320" w:hanging="360"/>
+      </w:pPr>
+      <w:rPr>
+        <w:rFonts w:ascii="Wingdings" w:hAnsi="Wingdings" w:hint="default"/>
+      </w:rPr>
+    </w:lvl>
+    <w:lvl w:ilvl="6" w:tplc="40090001" w:tentative="1">
+      <w:start w:val="1"/>
+      <w:numFmt w:val="bullet"/>
+      <w:lvlText w:val=""/>
+      <w:lvlJc w:val="left"/>
+      <w:pPr>
+        <w:ind w:left="5040" w:hanging="360"/>
+      </w:pPr>
+      <w:rPr>
+        <w:rFonts w:ascii="Symbol" w:hAnsi="Symbol" w:hint="default"/>
+      </w:rPr>
+    </w:lvl>
+    <w:lvl w:ilvl="7" w:tplc="40090003" w:tentative="1">
+      <w:start w:val="1"/>
+      <w:numFmt w:val="bullet"/>
+      <w:lvlText w:val="o"/>
+      <w:lvlJc w:val="left"/>
+      <w:pPr>
+        <w:ind w:left="5760" w:hanging="360"/>
+      </w:pPr>
+      <w:rPr>
+        <w:rFonts w:ascii="Courier New" w:hAnsi="Courier New" w:cs="Courier New" w:hint="default"/>
+      </w:rPr>
+    </w:lvl>
+    <w:lvl w:ilvl="8" w:tplc="40090005" w:tentative="1">
+      <w:start w:val="1"/>
+      <w:numFmt w:val="bullet"/>
+      <w:lvlText w:val=""/>
+      <w:lvlJc w:val="left"/>
+      <w:pPr>
+        <w:ind w:left="6480" w:hanging="360"/>
+      </w:pPr>
+      <w:rPr>
+        <w:rFonts w:ascii="Wingdings" w:hAnsi="Wingdings" w:hint="default"/>
+      </w:rPr>
+    </w:lvl>
+  </w:abstractNum>
+  <w:num w:numId="1" w16cid:durableId="1176920025">
     <w:abstractNumId w:val="9"/>
   </w:num>
-  <w:num w:numId="2">
+  <w:num w:numId="2" w16cid:durableId="676659546">
     <w:abstractNumId w:val="7"/>
   </w:num>
-  <w:num w:numId="3">
+  <w:num w:numId="3" w16cid:durableId="168569562">
     <w:abstractNumId w:val="6"/>
   </w:num>
-  <w:num w:numId="4">
+  <w:num w:numId="4" w16cid:durableId="427890308">
     <w:abstractNumId w:val="5"/>
   </w:num>
-  <w:num w:numId="5">
+  <w:num w:numId="5" w16cid:durableId="255939009">
     <w:abstractNumId w:val="4"/>
   </w:num>
-  <w:num w:numId="6">
+  <w:num w:numId="6" w16cid:durableId="117456692">
     <w:abstractNumId w:val="8"/>
   </w:num>
-  <w:num w:numId="7">
+  <w:num w:numId="7" w16cid:durableId="809247505">
     <w:abstractNumId w:val="3"/>
   </w:num>
-  <w:num w:numId="8">
+  <w:num w:numId="8" w16cid:durableId="1354571058">
     <w:abstractNumId w:val="2"/>
   </w:num>
-  <w:num w:numId="9">
+  <w:num w:numId="9" w16cid:durableId="1777216352">
     <w:abstractNumId w:val="1"/>
   </w:num>
-  <w:num w:numId="10">
+  <w:num w:numId="10" w16cid:durableId="1121535362">
     <w:abstractNumId w:val="0"/>
+  </w:num>
+  <w:num w:numId="11" w16cid:durableId="194272566">
+    <w:abstractNumId w:val="10"/>
   </w:num>
 </w:numbering>
 </file>
 
 <file path=word/styles.xml><?xml version="1.0" encoding="utf-8"?>
-<w:styles xmlns:mc="http://schemas.openxmlformats.org/markup-compatibility/2006" xmlns:r="http://schemas.openxmlformats.org/officeDocument/2006/relationships" xmlns:w="http://schemas.openxmlformats.org/wordprocessingml/2006/main" xmlns:w14="http://schemas.microsoft.com/office/word/2010/wordml" xmlns:w15="http://schemas.microsoft.com/office/word/2012/wordml" xmlns:w16se="http://schemas.microsoft.com/office/word/2015/wordml/symex" mc:Ignorable="w14 w15 w16se">
+<w:styles xmlns:mc="http://schemas.openxmlformats.org/markup-compatibility/2006" xmlns:r="http://schemas.openxmlformats.org/officeDocument/2006/relationships" xmlns:w="http://schemas.openxmlformats.org/wordprocessingml/2006/main" xmlns:w14="http://schemas.microsoft.com/office/word/2010/wordml" xmlns:w15="http://schemas.microsoft.com/office/word/2012/wordml" xmlns:w16cex="http://schemas.microsoft.com/office/word/2018/wordml/cex" xmlns:w16cid="http://schemas.microsoft.com/office/word/2016/wordml/cid" xmlns:w16="http://schemas.microsoft.com/office/word/2018/wordml" xmlns:w16du="http://schemas.microsoft.com/office/word/2023/wordml/word16du" xmlns:w16sdtdh="http://schemas.microsoft.com/office/word/2020/wordml/sdtdatahash" xmlns:w16sdtfl="http://schemas.microsoft.com/office/word/2024/wordml/sdtformatlock" xmlns:w16se="http://schemas.microsoft.com/office/word/2015/wordml/symex" mc:Ignorable="w14 w15 w16se w16cid w16 w16cex w16sdtdh w16sdtfl w16du">
   <w:docDefaults>
     <w:rPrDefault>
       <w:rPr>
@@ -2078,7 +3707,7 @@
     </w:rPrDefault>
     <w:pPrDefault/>
   </w:docDefaults>
-  <w:latentStyles w:defLockedState="0" w:defUIPriority="99" w:defSemiHidden="0" w:defUnhideWhenUsed="0" w:defQFormat="0" w:count="371">
+  <w:latentStyles w:defLockedState="0" w:defUIPriority="99" w:defSemiHidden="0" w:defUnhideWhenUsed="0" w:defQFormat="0" w:count="376">
     <w:lsdException w:name="Normal" w:uiPriority="0" w:qFormat="1"/>
     <w:lsdException w:name="heading 1" w:uiPriority="9" w:qFormat="1"/>
     <w:lsdException w:name="heading 2" w:uiPriority="0" w:qFormat="1"/>
@@ -2450,6 +4079,11 @@
     <w:lsdException w:name="List Table 5 Dark Accent 6" w:uiPriority="50"/>
     <w:lsdException w:name="List Table 6 Colorful Accent 6" w:uiPriority="51"/>
     <w:lsdException w:name="List Table 7 Colorful Accent 6" w:uiPriority="52"/>
+    <w:lsdException w:name="Mention" w:semiHidden="1" w:unhideWhenUsed="1"/>
+    <w:lsdException w:name="Smart Hyperlink" w:semiHidden="1" w:unhideWhenUsed="1"/>
+    <w:lsdException w:name="Hashtag" w:semiHidden="1" w:unhideWhenUsed="1"/>
+    <w:lsdException w:name="Unresolved Mention" w:semiHidden="1" w:unhideWhenUsed="1"/>
+    <w:lsdException w:name="Smart Link" w:semiHidden="1" w:unhideWhenUsed="1"/>
   </w:latentStyles>
   <w:style w:type="paragraph" w:default="1" w:styleId="Normal">
     <w:name w:val="Normal"/>
@@ -2632,7 +4266,6 @@
   <w:style w:type="character" w:default="1" w:styleId="DefaultParagraphFont">
     <w:name w:val="Default Paragraph Font"/>
     <w:uiPriority w:val="1"/>
-    <w:semiHidden/>
     <w:unhideWhenUsed/>
   </w:style>
   <w:style w:type="table" w:default="1" w:styleId="TableNormal">

</xml_diff>